<commit_message>
Update project report with detailed algorithm comparisons and training insights
</commit_message>
<xml_diff>
--- a/Rapport.docx
+++ b/Rapport.docx
@@ -654,22 +654,25 @@
           </w:p>
           <w:p>
             <w:pPr>
-              <w:pStyle w:val="Titre4"/>
               <w:rPr>
+                <w:rFonts w:eastAsiaTheme="majorEastAsia" w:cstheme="majorBidi"/>
+                <w:i/>
+                <w:iCs/>
                 <w:noProof/>
+                <w:color w:val="000000" w:themeColor="text1"/>
+                <w:sz w:val="30"/>
               </w:rPr>
             </w:pPr>
             <w:r>
               <w:rPr>
+                <w:rFonts w:eastAsiaTheme="majorEastAsia" w:cstheme="majorBidi"/>
+                <w:i/>
+                <w:iCs/>
                 <w:noProof/>
+                <w:color w:val="000000" w:themeColor="text1"/>
+                <w:sz w:val="30"/>
               </w:rPr>
-              <w:t>Ce projet vise à résoudre un problème complexe de rassemblement de troupeaux (shepherding) à l’aide d’algorithmes apprentissage par renforcement. L’objectif est d’entraîner un agent autonome (le berger) à guider une ou plusieurs entités (le</w:t>
-            </w:r>
-            <w:r>
-              <w:rPr>
-                <w:noProof/>
-              </w:rPr>
-              <w:t>s moutons) vers une zone cible.</w:t>
+              <w:t xml:space="preserve">Ce projet vise à résoudre un problème complexe de rassemblement de troupeaux (shepherding) à l’aide d’algorithmes apprentissage par renforcement. L’objectif est d’entraîner un agent autonome (le berger) à guider une ou plusieurs entités (les moutons) vers une zone cible. </w:t>
             </w:r>
           </w:p>
           <w:p/>
@@ -689,97 +692,7 @@
                 <w:sz w:val="30"/>
                 <w:szCs w:val="30"/>
               </w:rPr>
-              <w:t xml:space="preserve">Pour mener à bien cette étude, nous avons initialement </w:t>
-            </w:r>
-            <w:r>
-              <w:rPr>
-                <w:i/>
-                <w:iCs/>
-                <w:sz w:val="30"/>
-                <w:szCs w:val="30"/>
-              </w:rPr>
-              <w:t xml:space="preserve">évalué </w:t>
-            </w:r>
-            <w:r>
-              <w:rPr>
-                <w:i/>
-                <w:iCs/>
-                <w:sz w:val="30"/>
-                <w:szCs w:val="30"/>
-              </w:rPr>
-              <w:t xml:space="preserve">trois algorithmes : PPO, TD3 et DQN. Face à des temps d’entraînement prohibitifs dépassant les cinq heures pour TD3 et à une forte instabilité </w:t>
-            </w:r>
-            <w:r>
-              <w:rPr>
-                <w:i/>
-                <w:iCs/>
-                <w:sz w:val="30"/>
-                <w:szCs w:val="30"/>
-              </w:rPr>
-              <w:t>de ses premiers résultats</w:t>
-            </w:r>
-            <w:r>
-              <w:rPr>
-                <w:i/>
-                <w:iCs/>
-                <w:sz w:val="30"/>
-                <w:szCs w:val="30"/>
-              </w:rPr>
-              <w:t xml:space="preserve">, nous avons pris la décision technique d’abandonner </w:t>
-            </w:r>
-            <w:r>
-              <w:rPr>
-                <w:i/>
-                <w:iCs/>
-                <w:sz w:val="30"/>
-                <w:szCs w:val="30"/>
-              </w:rPr>
-              <w:t>cet algorithme</w:t>
-            </w:r>
-            <w:r>
-              <w:rPr>
-                <w:i/>
-                <w:iCs/>
-                <w:sz w:val="30"/>
-                <w:szCs w:val="30"/>
-              </w:rPr>
-              <w:t>. Notre étude se concentre donc sur une comparaison rigoureuse entre l’algorithme PPO, qui traite des vecteurs d’observation continus</w:t>
-            </w:r>
-            <w:r>
-              <w:rPr>
-                <w:i/>
-                <w:iCs/>
-                <w:sz w:val="30"/>
-                <w:szCs w:val="30"/>
-              </w:rPr>
-              <w:t xml:space="preserve"> (les coordonnées spatiales)</w:t>
-            </w:r>
-            <w:r>
-              <w:rPr>
-                <w:i/>
-                <w:iCs/>
-                <w:sz w:val="30"/>
-                <w:szCs w:val="30"/>
-              </w:rPr>
-              <w:t xml:space="preserve">, et l’algorithme DQN, qui s’appuie sur une perception visuelle </w:t>
-            </w:r>
-            <w:r>
-              <w:rPr>
-                <w:i/>
-                <w:iCs/>
-                <w:sz w:val="30"/>
-                <w:szCs w:val="30"/>
-              </w:rPr>
-              <w:t>(le traitement d’images de l’environnement)</w:t>
-            </w:r>
-            <w:r>
-              <w:rPr>
-                <w:i/>
-                <w:iCs/>
-                <w:sz w:val="30"/>
-                <w:szCs w:val="30"/>
-              </w:rPr>
-              <w:t>.</w:t>
+              <w:t xml:space="preserve">Pour mener a à bien cette étude, nous avons initialement trois algorithmes : PPO, TD3 et DQN. Face à des temps d’entraînement prohibitifs dépassant les cinq heures pour TD3 et à une forte instabilité initiale, nous avons pris la décision technique d’abandonner cet algorithme. Notre étude se concentre donc sur une comparaison rigoureuse entre l’algorithme PPO, qui traite des vecteurs d’observation continus, et l’algorithme DQN, qui s’appuie sur une perception visuelle (images) de l’environnement. </w:t>
             </w:r>
           </w:p>
           <w:p>
@@ -808,214 +721,7 @@
                 <w:sz w:val="30"/>
                 <w:szCs w:val="30"/>
               </w:rPr>
-              <w:t>Afin de mener à bien nos expériences de manière rigoureuse, nous avons optimisé les scripts d’exécution (</w:t>
-            </w:r>
-            <w:r>
-              <w:rPr>
-                <w:b/>
-                <w:bCs/>
-                <w:i/>
-                <w:iCs/>
-                <w:sz w:val="30"/>
-                <w:szCs w:val="30"/>
-              </w:rPr>
-              <w:t>train.py</w:t>
-            </w:r>
-            <w:r>
-              <w:rPr>
-                <w:i/>
-                <w:iCs/>
-                <w:sz w:val="30"/>
-                <w:szCs w:val="30"/>
-              </w:rPr>
-              <w:t xml:space="preserve"> et </w:t>
-            </w:r>
-            <w:r>
-              <w:rPr>
-                <w:b/>
-                <w:bCs/>
-                <w:i/>
-                <w:iCs/>
-                <w:sz w:val="30"/>
-                <w:szCs w:val="30"/>
-              </w:rPr>
-              <w:t>test.py</w:t>
-            </w:r>
-            <w:r>
-              <w:rPr>
-                <w:i/>
-                <w:iCs/>
-                <w:sz w:val="30"/>
-                <w:szCs w:val="30"/>
-              </w:rPr>
-              <w:t>) en y intégrant une gestion dynamique des hyperparamètres. Les modèles entraînés de zéro (</w:t>
-            </w:r>
-            <w:r>
-              <w:rPr>
-                <w:b/>
-                <w:bCs/>
-                <w:i/>
-                <w:iCs/>
-                <w:sz w:val="30"/>
-                <w:szCs w:val="30"/>
-              </w:rPr>
-              <w:t xml:space="preserve">Train </w:t>
-            </w:r>
-            <w:proofErr w:type="spellStart"/>
-            <w:r>
-              <w:rPr>
-                <w:b/>
-                <w:bCs/>
-                <w:i/>
-                <w:iCs/>
-                <w:sz w:val="30"/>
-                <w:szCs w:val="30"/>
-              </w:rPr>
-              <w:t>from</w:t>
-            </w:r>
-            <w:proofErr w:type="spellEnd"/>
-            <w:r>
-              <w:rPr>
-                <w:b/>
-                <w:bCs/>
-                <w:i/>
-                <w:iCs/>
-                <w:sz w:val="30"/>
-                <w:szCs w:val="30"/>
-              </w:rPr>
-              <w:t xml:space="preserve"> Scratch</w:t>
-            </w:r>
-            <w:r>
-              <w:rPr>
-                <w:i/>
-                <w:iCs/>
-                <w:sz w:val="30"/>
-                <w:szCs w:val="30"/>
-              </w:rPr>
-              <w:t xml:space="preserve">) ont bénéficié d’une phase d’apprentissage longue </w:t>
-            </w:r>
-            <w:r>
-              <w:rPr>
-                <w:i/>
-                <w:iCs/>
-                <w:sz w:val="30"/>
-                <w:szCs w:val="30"/>
-              </w:rPr>
-              <w:t xml:space="preserve">définie </w:t>
-            </w:r>
-            <w:r>
-              <w:rPr>
-                <w:i/>
-                <w:iCs/>
-                <w:sz w:val="30"/>
-                <w:szCs w:val="30"/>
-              </w:rPr>
-              <w:t>sur 2</w:t>
-            </w:r>
-            <w:r>
-              <w:rPr>
-                <w:i/>
-                <w:iCs/>
-                <w:sz w:val="30"/>
-                <w:szCs w:val="30"/>
-              </w:rPr>
-              <w:t> </w:t>
-            </w:r>
-            <w:r>
-              <w:rPr>
-                <w:i/>
-                <w:iCs/>
-                <w:sz w:val="30"/>
-                <w:szCs w:val="30"/>
-              </w:rPr>
-              <w:t>000</w:t>
-            </w:r>
-            <w:r>
-              <w:rPr>
-                <w:i/>
-                <w:iCs/>
-                <w:sz w:val="30"/>
-                <w:szCs w:val="30"/>
-              </w:rPr>
-              <w:t xml:space="preserve"> </w:t>
-            </w:r>
-            <w:r>
-              <w:rPr>
-                <w:i/>
-                <w:iCs/>
-                <w:sz w:val="30"/>
-                <w:szCs w:val="30"/>
-              </w:rPr>
-              <w:t xml:space="preserve">000 de </w:t>
-            </w:r>
-            <w:proofErr w:type="spellStart"/>
-            <w:r>
-              <w:rPr>
-                <w:i/>
-                <w:iCs/>
-                <w:sz w:val="30"/>
-                <w:szCs w:val="30"/>
-              </w:rPr>
-              <w:t>timesteps</w:t>
-            </w:r>
-            <w:proofErr w:type="spellEnd"/>
-            <w:r>
-              <w:rPr>
-                <w:i/>
-                <w:iCs/>
-                <w:sz w:val="30"/>
-                <w:szCs w:val="30"/>
-              </w:rPr>
-              <w:t xml:space="preserve">. Par ailleurs, nous avons automatisé la logique du </w:t>
-            </w:r>
-            <w:r>
-              <w:rPr>
-                <w:b/>
-                <w:bCs/>
-                <w:i/>
-                <w:iCs/>
-                <w:sz w:val="30"/>
-                <w:szCs w:val="30"/>
-              </w:rPr>
-              <w:t>Curriculum Learning</w:t>
-            </w:r>
-            <w:r>
-              <w:rPr>
-                <w:i/>
-                <w:iCs/>
-                <w:sz w:val="30"/>
-                <w:szCs w:val="30"/>
-              </w:rPr>
-              <w:t xml:space="preserve"> (via un argument -cl) : cette méthode charge les poids du modèle précédent</w:t>
-            </w:r>
-            <w:r>
-              <w:rPr>
-                <w:i/>
-                <w:iCs/>
-                <w:sz w:val="30"/>
-                <w:szCs w:val="30"/>
-              </w:rPr>
-              <w:t xml:space="preserve">, réinitialise l’état de l’optimiseur pour favoriser une nouvelle exploration, et réduit la durée d’entraînement à 1 000 000 de </w:t>
-            </w:r>
-            <w:proofErr w:type="spellStart"/>
-            <w:r>
-              <w:rPr>
-                <w:i/>
-                <w:iCs/>
-                <w:sz w:val="30"/>
-                <w:szCs w:val="30"/>
-              </w:rPr>
-              <w:t>timesteps</w:t>
-            </w:r>
-            <w:proofErr w:type="spellEnd"/>
-            <w:r>
-              <w:rPr>
-                <w:i/>
-                <w:iCs/>
-                <w:sz w:val="30"/>
-                <w:szCs w:val="30"/>
-              </w:rPr>
-              <w:t xml:space="preserve">, divisant ainsi notre empreinte de calcul par deux. </w:t>
+              <w:t xml:space="preserve">Afin de mener à bien nos expériences de manière rigoureuse, nous avons optimisé les scripts d’exécution (train.py et test.py) en y intégrant une gestion dynamique des hyperparamètres. Les modèles entraînés de zéro (Train from Scratch) ont bénéficié d’une phase d’apprentissage longue sur 2 000 000 de timesteps. Par ailleurs, nous avons automatisé la logique du Curriculum Learning (via un argument -cl) : cette méthode charge les poids du modèle précédent, réinitialise l’état de l’optimiseur pour favoriser une nouvelle exploration, et réduit la durée d’entraînement à 1 000 000 de timesteps, divisant ainsi notre empreinte de calcul par deux. </w:t>
             </w:r>
           </w:p>
           <w:p>
@@ -1044,87 +750,7 @@
                 <w:sz w:val="30"/>
                 <w:szCs w:val="30"/>
               </w:rPr>
-              <w:t>Enfin, pour garantir la viabilité statistique de nos résultats (</w:t>
-            </w:r>
-            <w:proofErr w:type="spellStart"/>
-            <w:r>
-              <w:rPr>
-                <w:i/>
-                <w:iCs/>
-                <w:sz w:val="30"/>
-                <w:szCs w:val="30"/>
-              </w:rPr>
-              <w:t>Sucess</w:t>
-            </w:r>
-            <w:proofErr w:type="spellEnd"/>
-            <w:r>
-              <w:rPr>
-                <w:i/>
-                <w:iCs/>
-                <w:sz w:val="30"/>
-                <w:szCs w:val="30"/>
-              </w:rPr>
-              <w:t xml:space="preserve"> Rate, </w:t>
-            </w:r>
-            <w:proofErr w:type="spellStart"/>
-            <w:r>
-              <w:rPr>
-                <w:i/>
-                <w:iCs/>
-                <w:sz w:val="30"/>
-                <w:szCs w:val="30"/>
-              </w:rPr>
-              <w:t>Average</w:t>
-            </w:r>
-            <w:proofErr w:type="spellEnd"/>
-            <w:r>
-              <w:rPr>
-                <w:i/>
-                <w:iCs/>
-                <w:sz w:val="30"/>
-                <w:szCs w:val="30"/>
-              </w:rPr>
-              <w:t xml:space="preserve"> </w:t>
-            </w:r>
-            <w:proofErr w:type="spellStart"/>
-            <w:r>
-              <w:rPr>
-                <w:i/>
-                <w:iCs/>
-                <w:sz w:val="30"/>
-                <w:szCs w:val="30"/>
-              </w:rPr>
-              <w:t>Reward</w:t>
-            </w:r>
-            <w:proofErr w:type="spellEnd"/>
-            <w:r>
-              <w:rPr>
-                <w:i/>
-                <w:iCs/>
-                <w:sz w:val="30"/>
-                <w:szCs w:val="30"/>
-              </w:rPr>
-              <w:t xml:space="preserve">, </w:t>
-            </w:r>
-            <w:proofErr w:type="spellStart"/>
-            <w:r>
-              <w:rPr>
-                <w:i/>
-                <w:iCs/>
-                <w:sz w:val="30"/>
-                <w:szCs w:val="30"/>
-              </w:rPr>
-              <w:t>Average</w:t>
-            </w:r>
-            <w:proofErr w:type="spellEnd"/>
-            <w:r>
-              <w:rPr>
-                <w:i/>
-                <w:iCs/>
-                <w:sz w:val="30"/>
-                <w:szCs w:val="30"/>
-              </w:rPr>
-              <w:t xml:space="preserve"> Duration), les phases de test ont été systématiquement paramétrées pour s’exécuter sur une moyenne de 1000 épisodes (-n 1000).</w:t>
+              <w:t xml:space="preserve">Enfin, pour garantir la viabilité statistique de nos résultats (Sucess Rate, Average Reward, Average Duration) et en extraire l'écart-type (l'incertitude ±), les phases de test ont été systématiquement paramétrées pour s’exécuter sur une moyenne de 1000 épisodes (-n 1000). </w:t>
             </w:r>
           </w:p>
           <w:p>
@@ -1323,59 +949,13 @@
     </w:p>
     <w:p>
       <w:r>
-        <w:t>L’entraînement de nos agents s’est déroulé sur trois niveaux de complexité croissante : un environnement statique (Niveau 1), un environnement dynamique</w:t>
-      </w:r>
-      <w:r>
-        <w:t>,</w:t>
-      </w:r>
-      <w:r>
-        <w:t xml:space="preserve"> où le mouton possède un mouvement aléatoire (Niveau 2), et enfin un environnement contraint par la présence d’un obstacle physique (Niveau 3). </w:t>
+        <w:t>L’entraînement de nos agents s’est déroulé sur trois niveaux de complexité croissante : un environnement statique (Niveau 1), un environnement dynamique où le mouton possède un mouvement aléatoire (Niveau 2), et enfin un environnement contraint par la présence d’un obstacle physique (Niveau 3). Afin de modéliser l'évolution de la difficulté entre ces différents niveaux, nous avons apporté une modification structurelle au code de la simulation physique fournie initialement (shepherd_env.py).</w:t>
       </w:r>
     </w:p>
     <w:p/>
     <w:p>
       <w:r>
-        <w:t>Pour justifier cette gradation, nous avons apporté une modification structurelle au code de la simulation physique (</w:t>
-      </w:r>
-      <w:r>
-        <w:rPr>
-          <w:b/>
-          <w:bCs/>
-        </w:rPr>
-        <w:t>shepherd_env.py</w:t>
-      </w:r>
-      <w:r>
-        <w:t xml:space="preserve">) en implémentant le mode </w:t>
-      </w:r>
-      <w:proofErr w:type="spellStart"/>
-      <w:r>
-        <w:rPr>
-          <w:b/>
-          <w:bCs/>
-        </w:rPr>
-        <w:t>active_sheep</w:t>
-      </w:r>
-      <w:proofErr w:type="spellEnd"/>
-      <w:r>
-        <w:t>. Dans la version initiale, les moutons restaient totalement immobiles tant que le berger n’entrait pas dans leur rayon d’action.</w:t>
-      </w:r>
-    </w:p>
-    <w:p/>
-    <w:p>
-      <w:r>
-        <w:t>Afin d’introduire un bruit stochastique réaliste, nous avons ajouté la règle suivante (</w:t>
-      </w:r>
-      <w:proofErr w:type="spellStart"/>
-      <w:r>
-        <w:rPr>
-          <w:b/>
-          <w:bCs/>
-        </w:rPr>
-        <w:t>elif</w:t>
-      </w:r>
-      <w:proofErr w:type="spellEnd"/>
-      <w:r>
-        <w:t>) :</w:t>
+        <w:t>Nous avons implémenté le mode active_sheep, qui redéfinit la règle de déplacement autonome des moutons selon la logique suivante :</w:t>
       </w:r>
     </w:p>
     <w:p/>
@@ -1428,49 +1008,26 @@
       <w:pPr>
         <w:jc w:val="center"/>
       </w:pPr>
-      <w:r>
-        <w:t>Figure 1 : Modification de code effectué</w:t>
-      </w:r>
     </w:p>
     <w:p>
-      <w:pPr>
-        <w:jc w:val="center"/>
-      </w:pPr>
-    </w:p>
-    <w:p>
-      <w:r>
-        <w:t>Ainsi, lorsque l’agent s’éloigne, les moutons dérivent aléatoirement. Cette modification force l’intelligence artificielle à anticiper et corriger en temps réel des trajectoires mobiles, augmentant significativement la difficulté d’apprentissage pour les Niveau 2 et 3.</w:t>
+      <w:r>
+        <w:t>Dans la version initiale (exclusivement utilisée pour le Niveau 1), les moutons étaient purement "réactifs" : ils restaient totalement immobiles tant que le chien de berger n'entrait pas dans leur rayon d'action. Bien que parfaite pour initier l'agent aux mécaniques de base, cette logique manquait de réalisme. L'ajout de ce comportement stochastique (elif self.active_sheep) permet d'introduire un bruit permanent. Lorsque l'agent s'éloigne, les moutons non surveillés commencent à dériver de manière aléatoire, simulant de manière beaucoup plus fidèle le comportement d'un véritable troupeau. Cette modification est fondamentale pour justifier les Niveaux 2 et 3, car elle force l'intelligence artificielle à anticiper et corriger en temps réel les trajectoires d'entités mobiles, augmentant significativement la difficulté de la tâche.</w:t>
       </w:r>
     </w:p>
     <w:p/>
     <w:p>
       <w:r>
-        <w:t>Afin de valider la viabilité de ces environnements et d’établir une base de comparaison solide, nous avons d’abord évalué les trois comportements de référence (</w:t>
-      </w:r>
-      <w:proofErr w:type="spellStart"/>
-      <w:r>
-        <w:t>Baselines</w:t>
-      </w:r>
-      <w:proofErr w:type="spellEnd"/>
-      <w:r>
-        <w:t xml:space="preserve">). Comme l’exige le protocole, l’ensemble des métriques de base pour le </w:t>
+        <w:t xml:space="preserve">Afin de valider la viabilité physique de ces environnements, nous avons d’abord évalué trois comportements de références (Baselines). Le tableau ci-dessous regroupe l'ensemble des métriques de référence pour le </w:t>
       </w:r>
       <w:r>
         <w:rPr>
           <w:b/>
           <w:bCs/>
         </w:rPr>
-        <w:t>Niveau 1</w:t>
-      </w:r>
-      <w:r>
-        <w:rPr>
-          <w:b/>
-          <w:bCs/>
-        </w:rPr>
-        <w:t xml:space="preserve"> (1 mouton)</w:t>
-      </w:r>
-      <w:r>
-        <w:t xml:space="preserve"> sont détaillées dans le tableau ci-dessous, en incluant également nos premiers entraînements d’IA :</w:t>
+        <w:t>Niveau 1 (1 mouton)</w:t>
+      </w:r>
+      <w:r>
+        <w:t xml:space="preserve"> sur 1000 épisodes :</w:t>
       </w:r>
     </w:p>
     <w:p/>
@@ -1513,33 +1070,18 @@
             <w:tcW w:w="2130" w:type="dxa"/>
           </w:tcPr>
           <w:p>
-            <w:proofErr w:type="spellStart"/>
             <w:r>
-              <w:t>Average</w:t>
+              <w:t>Average Reward</w:t>
             </w:r>
-            <w:proofErr w:type="spellEnd"/>
+          </w:p>
+        </w:tc>
+        <w:tc>
+          <w:tcPr>
+            <w:tcW w:w="2130" w:type="dxa"/>
+          </w:tcPr>
+          <w:p>
             <w:r>
-              <w:t xml:space="preserve"> </w:t>
-            </w:r>
-            <w:proofErr w:type="spellStart"/>
-            <w:r>
-              <w:t>Reward</w:t>
-            </w:r>
-            <w:proofErr w:type="spellEnd"/>
-          </w:p>
-        </w:tc>
-        <w:tc>
-          <w:tcPr>
-            <w:tcW w:w="2130" w:type="dxa"/>
-          </w:tcPr>
-          <w:p>
-            <w:proofErr w:type="spellStart"/>
-            <w:r>
-              <w:t>Averag</w:t>
-            </w:r>
-            <w:proofErr w:type="spellEnd"/>
-            <w:r>
-              <w:t xml:space="preserve"> Episode Length</w:t>
+              <w:t>Averag Episode Length</w:t>
             </w:r>
           </w:p>
         </w:tc>
@@ -1591,13 +1133,8 @@
           </w:tcPr>
           <w:p>
             <w:r>
-              <w:t xml:space="preserve">31.7 </w:t>
+              <w:t>31.7 steps</w:t>
             </w:r>
-            <w:proofErr w:type="spellStart"/>
-            <w:r>
-              <w:t>steps</w:t>
-            </w:r>
-            <w:proofErr w:type="spellEnd"/>
           </w:p>
         </w:tc>
         <w:tc>
@@ -1617,11 +1154,9 @@
             <w:tcW w:w="2129" w:type="dxa"/>
           </w:tcPr>
           <w:p>
-            <w:proofErr w:type="spellStart"/>
             <w:r>
               <w:t>Lazy</w:t>
             </w:r>
-            <w:proofErr w:type="spellEnd"/>
           </w:p>
         </w:tc>
         <w:tc>
@@ -1650,13 +1185,8 @@
           </w:tcPr>
           <w:p>
             <w:r>
-              <w:t xml:space="preserve">450.2 </w:t>
+              <w:t>450.2 steps</w:t>
             </w:r>
-            <w:proofErr w:type="spellStart"/>
-            <w:r>
-              <w:t>steps</w:t>
-            </w:r>
-            <w:proofErr w:type="spellEnd"/>
           </w:p>
         </w:tc>
         <w:tc>
@@ -1676,11 +1206,9 @@
             <w:tcW w:w="2129" w:type="dxa"/>
           </w:tcPr>
           <w:p>
-            <w:proofErr w:type="spellStart"/>
             <w:r>
               <w:t>Tipsy</w:t>
             </w:r>
-            <w:proofErr w:type="spellEnd"/>
           </w:p>
         </w:tc>
         <w:tc>
@@ -1709,13 +1237,8 @@
           </w:tcPr>
           <w:p>
             <w:r>
-              <w:t xml:space="preserve">463.6 </w:t>
+              <w:t>463.6 steps</w:t>
             </w:r>
-            <w:proofErr w:type="spellStart"/>
-            <w:r>
-              <w:t>steps</w:t>
-            </w:r>
-            <w:proofErr w:type="spellEnd"/>
           </w:p>
         </w:tc>
         <w:tc>
@@ -1766,13 +1289,8 @@
           </w:tcPr>
           <w:p>
             <w:r>
-              <w:t xml:space="preserve">214.36 </w:t>
+              <w:t>214.36 steps</w:t>
             </w:r>
-            <w:proofErr w:type="spellStart"/>
-            <w:r>
-              <w:t>steps</w:t>
-            </w:r>
-            <w:proofErr w:type="spellEnd"/>
           </w:p>
         </w:tc>
         <w:tc>
@@ -1823,28 +1341,17 @@
           </w:tcPr>
           <w:p>
             <w:r>
-              <w:t>410.3</w:t>
+              <w:t>410.3 steps</w:t>
             </w:r>
+          </w:p>
+        </w:tc>
+        <w:tc>
+          <w:tcPr>
+            <w:tcW w:w="2130" w:type="dxa"/>
+          </w:tcPr>
+          <w:p>
             <w:r>
-              <w:t xml:space="preserve"> </w:t>
-            </w:r>
-            <w:proofErr w:type="spellStart"/>
-            <w:r>
-              <w:t>steps</w:t>
-            </w:r>
-            <w:proofErr w:type="spellEnd"/>
-          </w:p>
-        </w:tc>
-        <w:tc>
-          <w:tcPr>
-            <w:tcW w:w="2130" w:type="dxa"/>
-          </w:tcPr>
-          <w:p>
-            <w:r>
-              <w:t>~ 1.3</w:t>
-            </w:r>
-            <w:r>
-              <w:t xml:space="preserve"> heures</w:t>
+              <w:t>~ 1.3 heures</w:t>
             </w:r>
           </w:p>
         </w:tc>
@@ -1886,28 +1393,17 @@
           </w:tcPr>
           <w:p>
             <w:r>
-              <w:t>425.1</w:t>
+              <w:t>425.1 steps</w:t>
             </w:r>
+          </w:p>
+        </w:tc>
+        <w:tc>
+          <w:tcPr>
+            <w:tcW w:w="2130" w:type="dxa"/>
+          </w:tcPr>
+          <w:p>
             <w:r>
-              <w:t xml:space="preserve"> </w:t>
-            </w:r>
-            <w:proofErr w:type="spellStart"/>
-            <w:r>
-              <w:t>steps</w:t>
-            </w:r>
-            <w:proofErr w:type="spellEnd"/>
-          </w:p>
-        </w:tc>
-        <w:tc>
-          <w:tcPr>
-            <w:tcW w:w="2130" w:type="dxa"/>
-          </w:tcPr>
-          <w:p>
-            <w:r>
-              <w:t>&gt; 5.2</w:t>
-            </w:r>
-            <w:r>
-              <w:t xml:space="preserve"> heures</w:t>
+              <w:t>&gt; 5.2 heures</w:t>
             </w:r>
           </w:p>
         </w:tc>
@@ -1916,57 +1412,7 @@
     <w:p/>
     <w:p>
       <w:r>
-        <w:t xml:space="preserve">L'expert </w:t>
-      </w:r>
-      <w:r>
-        <w:rPr>
-          <w:i/>
-          <w:iCs/>
-        </w:rPr>
-        <w:t>Rule-Based</w:t>
-      </w:r>
-      <w:r>
-        <w:t xml:space="preserve"> valide parfaitement la logique physique. Cette robustesse se confirme aux niveaux supérieurs (Niveaux 2 et 3) avec des récompenses moyennes toujours positives et des épisodes courts. Il montre néanmoins ses premières limites face à l'obstacle au Niveau 3 avec 3 moutons, où son taux de succès tombe à 76% et sa durée moyenne monte à près de 300 </w:t>
-      </w:r>
-      <w:proofErr w:type="spellStart"/>
-      <w:r>
-        <w:t>steps</w:t>
-      </w:r>
-      <w:proofErr w:type="spellEnd"/>
-      <w:r>
-        <w:t xml:space="preserve">. Les agents </w:t>
-      </w:r>
-      <w:proofErr w:type="spellStart"/>
-      <w:r>
-        <w:rPr>
-          <w:i/>
-          <w:iCs/>
-        </w:rPr>
-        <w:t>Lazy</w:t>
-      </w:r>
-      <w:proofErr w:type="spellEnd"/>
-      <w:r>
-        <w:t xml:space="preserve"> et </w:t>
-      </w:r>
-      <w:proofErr w:type="spellStart"/>
-      <w:r>
-        <w:rPr>
-          <w:i/>
-          <w:iCs/>
-        </w:rPr>
-        <w:t>Tipsy</w:t>
-      </w:r>
-      <w:proofErr w:type="spellEnd"/>
-      <w:r>
-        <w:t xml:space="preserve">, quant à eux, maximisent systématiquement la durée des épisodes (400 à 500 </w:t>
-      </w:r>
-      <w:proofErr w:type="spellStart"/>
-      <w:r>
-        <w:t>steps</w:t>
-      </w:r>
-      <w:proofErr w:type="spellEnd"/>
-      <w:r>
-        <w:t>) avec des récompenses fortement négatives sur l'ensemble des 3 niveaux, ne dépassant jamais la barre des 25% de réussite, qu'il y ait 1 ou 3 moutons.</w:t>
+        <w:t>A l’inverse, notre algorithme expert codé en dur ( Rule-Based ) valide parfaitement la logique de l’environnement, atteignant un taux de réussite de 100 avec un mouton, et de 94% avec trois moutons. Les modèles Lazy (immobile) et Tipsy (mouvement aléatoire) affichent des taux de succès marginaux (10% à 20%), confirmant qu’une stratégie intelligente est indispensable. L'ajout des barres d'erreur (±) sur nos graphiques permet désormais d'attester de la stabilité de ces résultats.</w:t>
       </w:r>
     </w:p>
     <w:p/>
@@ -1979,10 +1425,10 @@
           <w:noProof/>
         </w:rPr>
         <w:drawing>
-          <wp:inline distT="0" distB="0" distL="0" distR="0" wp14:anchorId="31C4F5AF" wp14:editId="219FF25C">
-            <wp:extent cx="4579123" cy="2744583"/>
-            <wp:effectExtent l="0" t="0" r="0" b="0"/>
-            <wp:docPr id="1934585549" name="Image 5"/>
+          <wp:inline distT="0" distB="0" distL="0" distR="0" wp14:anchorId="49DC077A" wp14:editId="4665E309">
+            <wp:extent cx="4525231" cy="2715223"/>
+            <wp:effectExtent l="0" t="0" r="0" b="9525"/>
+            <wp:docPr id="2083691525" name="Image 5"/>
             <wp:cNvGraphicFramePr>
               <a:graphicFrameLocks xmlns:a="http://schemas.openxmlformats.org/drawingml/2006/main" noChangeAspect="1"/>
             </wp:cNvGraphicFramePr>
@@ -2011,7 +1457,7 @@
                   <pic:spPr bwMode="auto">
                     <a:xfrm>
                       <a:off x="0" y="0"/>
-                      <a:ext cx="4584499" cy="2747805"/>
+                      <a:ext cx="4545040" cy="2727109"/>
                     </a:xfrm>
                     <a:prstGeom prst="rect">
                       <a:avLst/>
@@ -2039,16 +1485,7 @@
         </w:rPr>
       </w:pPr>
       <w:r>
-        <w:t xml:space="preserve">Figure </w:t>
-      </w:r>
-      <w:r>
-        <w:t>2</w:t>
-      </w:r>
-      <w:r>
-        <w:t xml:space="preserve"> : Comparaison des performances (Success Rate) au Niveau 1.</w:t>
-      </w:r>
-      <w:r>
-        <w:t xml:space="preserve"> </w:t>
+        <w:t>Figure 1 : Comparaison des performances initiales (Niveau 1) avec incertitudes statistiques.</w:t>
       </w:r>
       <w:r>
         <w:br w:type="page"/>
@@ -2063,67 +1500,16 @@
         <w:t>Apprentissage et Curriculum (1 Mouton)</w:t>
       </w:r>
     </w:p>
+    <w:p/>
     <w:p>
       <w:r>
-        <w:t xml:space="preserve">L'entraînement sur un seul mouton a permis d'établir une preuve de concept solide. Dès le Niveau 1, comme le montre le tableau précédent, l'agent PPO prend une avance décisive (53% de réussite, épisodes de 214 </w:t>
-      </w:r>
-      <w:proofErr w:type="spellStart"/>
-      <w:r>
-        <w:t>steps</w:t>
-      </w:r>
-      <w:proofErr w:type="spellEnd"/>
-      <w:r>
-        <w:t xml:space="preserve"> en moyenne), résolvant l'environnement deux fois plus vite que DQN (410 </w:t>
-      </w:r>
-      <w:proofErr w:type="spellStart"/>
-      <w:r>
-        <w:t>steps</w:t>
-      </w:r>
-      <w:proofErr w:type="spellEnd"/>
-      <w:r>
-        <w:t>).</w:t>
+        <w:t>L’entraînement d’un seul mouton a permis d’établir une preuve de concept solide. Dès le Niveau 1, l'agent PPO prend une avance décisive (58.1% de réussite moyenne), résolvant l'environnement deux fois plus vite que DQN qui peine à généraliser (15.9% de succès).</w:t>
       </w:r>
     </w:p>
     <w:p/>
     <w:p>
       <w:r>
-        <w:t xml:space="preserve">Le passage au Niveau 2 a été l'occasion de tester nos différentes méthodes d'adaptation. L'approche par </w:t>
-      </w:r>
-      <w:r>
-        <w:rPr>
-          <w:i/>
-          <w:iCs/>
-        </w:rPr>
-        <w:t>Curriculum Learning</w:t>
-      </w:r>
-      <w:r>
-        <w:t xml:space="preserve"> (fine-tuning du modèle statique sur le niveau dynamique) s'est révélée redoutable : l'agent PPO hisse son taux de réussite à 60%, surpassant ainsi un entraînement repris entièrement de zéro (</w:t>
-      </w:r>
-      <w:r>
-        <w:rPr>
-          <w:i/>
-          <w:iCs/>
-        </w:rPr>
-        <w:t xml:space="preserve">Train </w:t>
-      </w:r>
-      <w:proofErr w:type="spellStart"/>
-      <w:r>
-        <w:rPr>
-          <w:i/>
-          <w:iCs/>
-        </w:rPr>
-        <w:t>from</w:t>
-      </w:r>
-      <w:proofErr w:type="spellEnd"/>
-      <w:r>
-        <w:rPr>
-          <w:i/>
-          <w:iCs/>
-        </w:rPr>
-        <w:t xml:space="preserve"> Scratch</w:t>
-      </w:r>
-      <w:r>
-        <w:t>, 56%). L'utilisation directe en "Zero-Shot" du modèle du Niveau 1 a tout de même permis de maintenir un score de 53%, prouvant la robustesse des politiques acquises par PPO.</w:t>
+        <w:t>Le passage au Niveau 2 a été l’occasion de tester différentes méthodes de transfert d’apprentissage. Les résultats statistiques montrent que l'utilisation directe (Direct Use) du modèle PPO entraîné au Niveau 1 résiste excellemment bien au bruit stochastique, conservant un taux de succès de 60.7% ± 3.0%. L’approche par Curriculum Learning (fine-tuning du modèle statique sur le niveau dynamique) maintient une performance très robuste de 53.2% ± 3.1%, surpassant ainsi un entraînement repris entièrement de zéro (Train from Scratch, 48.5% ± 3.1%). De son côté, DQN reste incapable de dépasser les 26% de succès, confirmant les limites de l'approche visuelle sur des cibles erratiques.</w:t>
       </w:r>
     </w:p>
     <w:p/>
@@ -2136,10 +1522,10 @@
           <w:noProof/>
         </w:rPr>
         <w:drawing>
-          <wp:inline distT="0" distB="0" distL="0" distR="0" wp14:anchorId="41E19706" wp14:editId="6747440D">
-            <wp:extent cx="4768850" cy="2858626"/>
+          <wp:inline distT="0" distB="0" distL="0" distR="0" wp14:anchorId="65D14357" wp14:editId="635EC985">
+            <wp:extent cx="4708442" cy="2825154"/>
             <wp:effectExtent l="0" t="0" r="0" b="0"/>
-            <wp:docPr id="1309927823" name="Image 6"/>
+            <wp:docPr id="2107919731" name="Image 6"/>
             <wp:cNvGraphicFramePr>
               <a:graphicFrameLocks xmlns:a="http://schemas.openxmlformats.org/drawingml/2006/main" noChangeAspect="1"/>
             </wp:cNvGraphicFramePr>
@@ -2147,7 +1533,7 @@
               <a:graphicData uri="http://schemas.openxmlformats.org/drawingml/2006/picture">
                 <pic:pic xmlns:pic="http://schemas.openxmlformats.org/drawingml/2006/picture">
                   <pic:nvPicPr>
-                    <pic:cNvPr id="0" name="Picture 2"/>
+                    <pic:cNvPr id="0" name="Picture 3"/>
                     <pic:cNvPicPr>
                       <a:picLocks noChangeAspect="1" noChangeArrowheads="1"/>
                     </pic:cNvPicPr>
@@ -2168,7 +1554,7 @@
                   <pic:spPr bwMode="auto">
                     <a:xfrm>
                       <a:off x="0" y="0"/>
-                      <a:ext cx="4776667" cy="2863312"/>
+                      <a:ext cx="4723438" cy="2834152"/>
                     </a:xfrm>
                     <a:prstGeom prst="rect">
                       <a:avLst/>
@@ -2190,13 +1576,7 @@
         <w:jc w:val="center"/>
       </w:pPr>
       <w:r>
-        <w:t xml:space="preserve">Figure </w:t>
-      </w:r>
-      <w:r>
-        <w:t>3</w:t>
-      </w:r>
-      <w:r>
-        <w:t xml:space="preserve"> : Impact de la méthode d'apprentissage sur le Niveau 2 (Mouton Actif).</w:t>
+        <w:t>Figure 2 : Impact de la méthode d'apprentissage sur le Niveau 2 (Mouton Actif).</w:t>
       </w:r>
     </w:p>
     <w:p>
@@ -2206,27 +1586,7 @@
     </w:p>
     <w:p>
       <w:r>
-        <w:t xml:space="preserve">Cependant, face à l'introduction d'un obstacle géométrique au Niveau 3, la dynamique s'est inversée. Le modèle PPO entraîné depuis zéro a légèrement surpassé le modèle issu du </w:t>
-      </w:r>
-      <w:r>
-        <w:rPr>
-          <w:i/>
-          <w:iCs/>
-        </w:rPr>
-        <w:t>Curriculum Learning</w:t>
-      </w:r>
-      <w:r>
-        <w:t xml:space="preserve"> (60% contre 52%). Lors des niveaux précédents, l'agent avait développé le réflexe de foncer en ligne droite vers le mouton. L'ajout d'un obstacle l'a obligé à "désapprendre" cette trajectoire directe. L'agent vierge (</w:t>
-      </w:r>
-      <w:r>
-        <w:rPr>
-          <w:i/>
-          <w:iCs/>
-        </w:rPr>
-        <w:t>Scratch</w:t>
-      </w:r>
-      <w:r>
-        <w:t>), n'ayant pas ce biais initial, a pu assimiler plus sainement la notion de contournement.</w:t>
+        <w:t>Cependant, face à l’introduction d’un obstacle géométrique (Niveau 3), la dynamique s’est inversée. Le modèle PPO entraîné depuis zéro (54.5% ± 3.1%) a surpassé le modèle issu du Curriculum Learning (46.3% ± 3.1%) et le Direct Use (qui chute à 44.2%). L’agent a en effet dû ‘désapprendre’ ses anciens réflexes de trajectoire en ligne droite pour assimiler sainement la notion de contournement. Un agent "vierge" a donc été avantagé face à cette nouvelle topologie.</w:t>
       </w:r>
     </w:p>
     <w:p/>
@@ -2239,10 +1599,10 @@
           <w:noProof/>
         </w:rPr>
         <w:drawing>
-          <wp:inline distT="0" distB="0" distL="0" distR="0" wp14:anchorId="492B6778" wp14:editId="6CE9CBEB">
-            <wp:extent cx="4667250" cy="2797723"/>
-            <wp:effectExtent l="0" t="0" r="0" b="3175"/>
-            <wp:docPr id="1619425619" name="Image 7"/>
+          <wp:inline distT="0" distB="0" distL="0" distR="0" wp14:anchorId="121646AD" wp14:editId="1F595F47">
+            <wp:extent cx="4691122" cy="2814762"/>
+            <wp:effectExtent l="0" t="0" r="0" b="5080"/>
+            <wp:docPr id="280101311" name="Image 7"/>
             <wp:cNvGraphicFramePr>
               <a:graphicFrameLocks xmlns:a="http://schemas.openxmlformats.org/drawingml/2006/main" noChangeAspect="1"/>
             </wp:cNvGraphicFramePr>
@@ -2250,7 +1610,7 @@
               <a:graphicData uri="http://schemas.openxmlformats.org/drawingml/2006/picture">
                 <pic:pic xmlns:pic="http://schemas.openxmlformats.org/drawingml/2006/picture">
                   <pic:nvPicPr>
-                    <pic:cNvPr id="0" name="Picture 3"/>
+                    <pic:cNvPr id="0" name="Picture 5"/>
                     <pic:cNvPicPr>
                       <a:picLocks noChangeAspect="1" noChangeArrowheads="1"/>
                     </pic:cNvPicPr>
@@ -2271,7 +1631,7 @@
                   <pic:spPr bwMode="auto">
                     <a:xfrm>
                       <a:off x="0" y="0"/>
-                      <a:ext cx="4677068" cy="2803608"/>
+                      <a:ext cx="4707081" cy="2824338"/>
                     </a:xfrm>
                     <a:prstGeom prst="rect">
                       <a:avLst/>
@@ -2293,19 +1653,8 @@
         <w:jc w:val="center"/>
       </w:pPr>
       <w:r>
-        <w:t xml:space="preserve">Figure </w:t>
-      </w:r>
-      <w:r>
-        <w:t>4</w:t>
-      </w:r>
-      <w:r>
-        <w:t xml:space="preserve"> : Impact de la méthode d'apprentissage face à un obstacle (Niveau 3).</w:t>
-      </w:r>
-    </w:p>
-    <w:p>
-      <w:pPr>
-        <w:jc w:val="center"/>
-      </w:pPr>
+        <w:t>Figure 3 : Impact de la méthode d'apprentissage face à un obstacle géométrique (Niveau 3).</w:t>
+      </w:r>
       <w:r>
         <w:br w:type="page"/>
       </w:r>
@@ -2319,15 +1668,16 @@
         <w:t>Le Défi de la Dimensionnalité (3 moutons)</w:t>
       </w:r>
     </w:p>
+    <w:p/>
     <w:p>
       <w:r>
-        <w:t>L'une des limites majeures identifiées lors de ce projet concerne la mise à l'échelle vers un système multi-entités. En appliquant nos modèles sur un troupeau de trois moutons, sans modifier la structure fondamentale du vecteur d'observation fourni à l'agent (comme précisé dans les consignes), nous nous sommes heurtés au phénomène du "mur de la dimensionnalité".</w:t>
+        <w:t>L’une des limites majeures identifiées lors de ce projet concerne la mise à l’échelle vers un système multi-entités. En appliquant nos modèles sur un troupeau de trois moutons, sans modifier la structure fondamentale du vecteur d’observation, nous nous sommes heurtés au ‘mur de la dimensionnalité’.</w:t>
       </w:r>
     </w:p>
     <w:p/>
     <w:p>
       <w:r>
-        <w:t>Les modèles d'apprentissage profond (PPO et DQN) s'effondrent de manière drastique, plafonnant entre 1% et 5% de réussite sur tous les niveaux, et ce malgré des temps d'entraînement répétés. En multipliant simplement les coordonnées en entrée, le réseau de neurones échoue à conceptualiser le groupe en tant qu'entité unique. L'agent tente alors d'interagir avec les moutons de manière isolée, ce qui a pour effet inévitable de disloquer le troupeau.</w:t>
+        <w:t>Les modèles d’apprentissage profond (PPO et DQN) s’effondrent de manière drastique, plafonnant entre 1% et 5% de réussite sur tous les niveaux. En multipliant simplement les coordonnées d’entrée le réseau de neurones échoue a conceptualiser le groupe en tant qu’entité unique. L’agent tente alors d’interagir avec les moutons de manière isolée, ce qui disloque le troupeau.</w:t>
       </w:r>
     </w:p>
     <w:p/>
@@ -2340,10 +1690,10 @@
           <w:noProof/>
         </w:rPr>
         <w:drawing>
-          <wp:inline distT="0" distB="0" distL="0" distR="0" wp14:anchorId="5EC3AD8D" wp14:editId="4F222B73">
-            <wp:extent cx="5467350" cy="3277333"/>
-            <wp:effectExtent l="0" t="0" r="0" b="0"/>
-            <wp:docPr id="1779489866" name="Image 8"/>
+          <wp:inline distT="0" distB="0" distL="0" distR="0" wp14:anchorId="7B5CAD00" wp14:editId="20F98468">
+            <wp:extent cx="4596151" cy="2757777"/>
+            <wp:effectExtent l="0" t="0" r="0" b="5080"/>
+            <wp:docPr id="1114325068" name="Image 8"/>
             <wp:cNvGraphicFramePr>
               <a:graphicFrameLocks xmlns:a="http://schemas.openxmlformats.org/drawingml/2006/main" noChangeAspect="1"/>
             </wp:cNvGraphicFramePr>
@@ -2351,7 +1701,7 @@
               <a:graphicData uri="http://schemas.openxmlformats.org/drawingml/2006/picture">
                 <pic:pic xmlns:pic="http://schemas.openxmlformats.org/drawingml/2006/picture">
                   <pic:nvPicPr>
-                    <pic:cNvPr id="0" name="Picture 4"/>
+                    <pic:cNvPr id="0" name="Picture 7"/>
                     <pic:cNvPicPr>
                       <a:picLocks noChangeAspect="1" noChangeArrowheads="1"/>
                     </pic:cNvPicPr>
@@ -2372,7 +1722,7 @@
                   <pic:spPr bwMode="auto">
                     <a:xfrm>
                       <a:off x="0" y="0"/>
-                      <a:ext cx="5468688" cy="3278135"/>
+                      <a:ext cx="4607153" cy="2764378"/>
                     </a:xfrm>
                     <a:prstGeom prst="rect">
                       <a:avLst/>
@@ -2394,13 +1744,7 @@
         <w:jc w:val="center"/>
       </w:pPr>
       <w:r>
-        <w:t xml:space="preserve">Figure </w:t>
-      </w:r>
-      <w:r>
-        <w:t>5</w:t>
-      </w:r>
-      <w:r>
-        <w:t xml:space="preserve"> : Effondrement des capacités de l'intelligence artificielle face à la gestion de 3 moutons.</w:t>
+        <w:t>Figure 4 : Effondrement des capacités de l'intelligence artificielle face à la gestion de 3 moutons.</w:t>
       </w:r>
     </w:p>
     <w:p>
@@ -2418,58 +1762,25 @@
     </w:p>
     <w:p/>
     <w:p>
-      <w:r>
-        <w:t>En raison des contraintes matérielles sévères et des temps de calcul particulièrement longs exigés par les algorithmes (plus de 2 heures par entraînement de modèle, multiplié par le nombre de méthodes et de niveaux testés), l'exploration poussée de l'environnement multi-agent impliquant plusieurs bergers simultanés (Niveau 4) n'a pas pu être menée à son terme. Nos ressources de calcul (</w:t>
-      </w:r>
-      <w:proofErr w:type="spellStart"/>
-      <w:r>
-        <w:t>Compute</w:t>
-      </w:r>
-      <w:proofErr w:type="spellEnd"/>
-      <w:r>
-        <w:t xml:space="preserve">) ont été priorisées sur l'analyse rigoureuse du </w:t>
-      </w:r>
-      <w:r>
-        <w:rPr>
-          <w:i/>
-          <w:iCs/>
-        </w:rPr>
-        <w:t>Curriculum Learning</w:t>
-      </w:r>
-      <w:r>
-        <w:t xml:space="preserve"> et l'optimisation comparative des modèles PPO et DQN sur les trois premiers niveaux, ce qui a représenté un volume d'expérimentation déjà considérable.</w:t>
+      <w:pPr>
+        <w:jc w:val="both"/>
+      </w:pPr>
+      <w:r>
+        <w:t>En raison des contraintes matérielles sévères et des temps de calcul particulièrement longs (jusqu'à 2,5 heures par modèle PPO sur 2 millions de steps), l'exploration poussée de l'environnement multi-agent impliquant plusieurs bergers simultanés (Niveau 4) n'a pas pu être menée à son terme. Nos ressources de calcul ont été priorisées sur l'extraction statistique rigoureuse sur 1000 épisodes, et l'optimisation comparative des modèles PPO et DQN sur les trois premiers niveaux.</w:t>
       </w:r>
     </w:p>
-    <w:p>
-      <w:pPr>
-        <w:jc w:val="center"/>
-      </w:pPr>
-    </w:p>
-    <w:p>
-      <w:pPr>
-        <w:rPr>
-          <w:rFonts w:asciiTheme="majorHAnsi" w:eastAsiaTheme="majorEastAsia" w:hAnsiTheme="majorHAnsi" w:cstheme="majorBidi"/>
-          <w:b/>
-          <w:color w:val="123869" w:themeColor="accent1"/>
-          <w:sz w:val="36"/>
-        </w:rPr>
-      </w:pPr>
-      <w:r>
-        <w:br w:type="page"/>
-      </w:r>
-    </w:p>
+    <w:p/>
     <w:p>
       <w:pPr>
         <w:pStyle w:val="Titre3"/>
       </w:pPr>
       <w:r>
-        <w:lastRenderedPageBreak/>
         <w:t>Conclusion</w:t>
       </w:r>
     </w:p>
     <w:p>
       <w:r>
-        <w:t>Ce projet met en lumière la supériorité systématique des réseaux de neurones exploitant des vecteurs d'état continus (PPO) par rapport aux approches purement visuelles (DQN) pour des tâches de navigation géométrique complexe.</w:t>
+        <w:t>Ce projet met en lumière la supériorité systématique des réseaux de neurones exploitant des vecteurs d’états continus (PPO) par rapport aux approches purement visuelles (DQN) pour des tâches de navigation géométrique complexe.</w:t>
       </w:r>
     </w:p>
     <w:p/>
@@ -2482,10 +1793,10 @@
           <w:noProof/>
         </w:rPr>
         <w:drawing>
-          <wp:inline distT="0" distB="0" distL="0" distR="0" wp14:anchorId="29CF30A6" wp14:editId="3EC60E5F">
-            <wp:extent cx="5245100" cy="3144108"/>
-            <wp:effectExtent l="0" t="0" r="0" b="0"/>
-            <wp:docPr id="674377814" name="Image 9"/>
+          <wp:inline distT="0" distB="0" distL="0" distR="0" wp14:anchorId="305ABFEB" wp14:editId="688A6960">
+            <wp:extent cx="4465821" cy="2679576"/>
+            <wp:effectExtent l="0" t="0" r="0" b="6985"/>
+            <wp:docPr id="1613299733" name="Image 9"/>
             <wp:cNvGraphicFramePr>
               <a:graphicFrameLocks xmlns:a="http://schemas.openxmlformats.org/drawingml/2006/main" noChangeAspect="1"/>
             </wp:cNvGraphicFramePr>
@@ -2493,7 +1804,7 @@
               <a:graphicData uri="http://schemas.openxmlformats.org/drawingml/2006/picture">
                 <pic:pic xmlns:pic="http://schemas.openxmlformats.org/drawingml/2006/picture">
                   <pic:nvPicPr>
-                    <pic:cNvPr id="0" name="Picture 5"/>
+                    <pic:cNvPr id="0" name="Picture 9"/>
                     <pic:cNvPicPr>
                       <a:picLocks noChangeAspect="1" noChangeArrowheads="1"/>
                     </pic:cNvPicPr>
@@ -2514,7 +1825,7 @@
                   <pic:spPr bwMode="auto">
                     <a:xfrm>
                       <a:off x="0" y="0"/>
-                      <a:ext cx="5251076" cy="3147690"/>
+                      <a:ext cx="4501185" cy="2700795"/>
                     </a:xfrm>
                     <a:prstGeom prst="rect">
                       <a:avLst/>
@@ -2536,13 +1847,80 @@
         <w:jc w:val="center"/>
       </w:pPr>
       <w:r>
-        <w:t xml:space="preserve">Figure </w:t>
-      </w:r>
-      <w:r>
-        <w:t>6</w:t>
-      </w:r>
-      <w:r>
-        <w:t xml:space="preserve"> : Bilan global des performances sur 1 mouton selon l'architecture du réseau.</w:t>
+        <w:t>Figure 5 : Bilan global des taux de succès sur 1 mouton.</w:t>
+      </w:r>
+    </w:p>
+    <w:p>
+      <w:r>
+        <w:lastRenderedPageBreak/>
+        <w:t>L'analyse de nos résultats est d'autant plus frappante lorsque l'on observe la distribution des récompenses moyennes avec leurs barres d'erreur (écart-type).</w:t>
+      </w:r>
+    </w:p>
+    <w:p/>
+    <w:p>
+      <w:pPr>
+        <w:jc w:val="center"/>
+      </w:pPr>
+      <w:r>
+        <w:rPr>
+          <w:noProof/>
+        </w:rPr>
+        <w:drawing>
+          <wp:inline distT="0" distB="0" distL="0" distR="0" wp14:anchorId="6F937585" wp14:editId="3232F915">
+            <wp:extent cx="5010592" cy="3006449"/>
+            <wp:effectExtent l="0" t="0" r="0" b="3810"/>
+            <wp:docPr id="1413220940" name="Image 10"/>
+            <wp:cNvGraphicFramePr>
+              <a:graphicFrameLocks xmlns:a="http://schemas.openxmlformats.org/drawingml/2006/main" noChangeAspect="1"/>
+            </wp:cNvGraphicFramePr>
+            <a:graphic xmlns:a="http://schemas.openxmlformats.org/drawingml/2006/main">
+              <a:graphicData uri="http://schemas.openxmlformats.org/drawingml/2006/picture">
+                <pic:pic xmlns:pic="http://schemas.openxmlformats.org/drawingml/2006/picture">
+                  <pic:nvPicPr>
+                    <pic:cNvPr id="0" name="Picture 11"/>
+                    <pic:cNvPicPr>
+                      <a:picLocks noChangeAspect="1" noChangeArrowheads="1"/>
+                    </pic:cNvPicPr>
+                  </pic:nvPicPr>
+                  <pic:blipFill>
+                    <a:blip r:embed="rId15" cstate="print">
+                      <a:extLst>
+                        <a:ext uri="{28A0092B-C50C-407E-A947-70E740481C1C}">
+                          <a14:useLocalDpi xmlns:a14="http://schemas.microsoft.com/office/drawing/2010/main" val="0"/>
+                        </a:ext>
+                      </a:extLst>
+                    </a:blip>
+                    <a:srcRect/>
+                    <a:stretch>
+                      <a:fillRect/>
+                    </a:stretch>
+                  </pic:blipFill>
+                  <pic:spPr bwMode="auto">
+                    <a:xfrm>
+                      <a:off x="0" y="0"/>
+                      <a:ext cx="5013811" cy="3008380"/>
+                    </a:xfrm>
+                    <a:prstGeom prst="rect">
+                      <a:avLst/>
+                    </a:prstGeom>
+                    <a:noFill/>
+                    <a:ln>
+                      <a:noFill/>
+                    </a:ln>
+                  </pic:spPr>
+                </pic:pic>
+              </a:graphicData>
+            </a:graphic>
+          </wp:inline>
+        </w:drawing>
+      </w:r>
+    </w:p>
+    <w:p>
+      <w:pPr>
+        <w:jc w:val="center"/>
+      </w:pPr>
+      <w:r>
+        <w:t>Figure 6 : Bilan global des récompenses moyennes et stabilité (Écart-type).</w:t>
       </w:r>
     </w:p>
     <w:p>
@@ -2552,7 +1930,51 @@
     </w:p>
     <w:p>
       <w:r>
-        <w:t xml:space="preserve">Nous avons prouvé, à travers nos optimisations, que le </w:t>
+        <w:t>Comme l'illustre la Figure 6, PPO obtient non seulement des scores plus élevés (barres bleues), mais l'amplitude de ses moustaches d'incertitude est beaucoup plus resserrée que celle de DQN, démontrant une stabilité comportementale nettement supérieure.</w:t>
+      </w:r>
+    </w:p>
+    <w:p/>
+    <w:p>
+      <w:r>
+        <w:t xml:space="preserve">Nous avons prouvé que le Curriculum Learning est une méthode redoutable pour accélérer l'adaptation à de nouvelles dynamiques (mouvements), bien qu'elle puisse créer des biais cognitifs si l'environnement subit un changement topologique trop brusque (obstacles). Enfin, l'échec de la généralisation sur plusieurs moutons souligne que la puissance d'un algorithme est intimement liée à la qualité de sa </w:t>
+      </w:r>
+      <w:r>
+        <w:rPr>
+          <w:i/>
+          <w:iCs/>
+        </w:rPr>
+        <w:t xml:space="preserve">State </w:t>
+      </w:r>
+      <w:r>
+        <w:rPr>
+          <w:i/>
+          <w:iCs/>
+        </w:rPr>
+        <w:t>Représentation</w:t>
+      </w:r>
+      <w:r>
+        <w:t>. Pour résoudre ce problème à grande échelle, il serait impératif de fournir à l'agent des métriques collectives, telles que le centre de gravité et le rayon de dispersion du troupeau.</w:t>
+      </w:r>
+    </w:p>
+    <w:p/>
+    <w:p>
+      <w:pPr>
+        <w:pStyle w:val="Titre4"/>
+      </w:pPr>
+      <w:r>
+        <w:t xml:space="preserve">Perspectives et Améliorations Futures </w:t>
+      </w:r>
+    </w:p>
+    <w:p/>
+    <w:p>
+      <w:r>
+        <w:t xml:space="preserve">Outre la refonte du vecteur d'observation pour la gestion multi-agent abordée </w:t>
+      </w:r>
+      <w:r>
+        <w:t>précédemment,</w:t>
+      </w:r>
+      <w:r>
+        <w:t xml:space="preserve"> une piste d'optimisation très prometteuse consisterait à appliquer la logique du </w:t>
       </w:r>
       <w:r>
         <w:rPr>
@@ -2562,62 +1984,23 @@
         <w:t>Curriculum Learning</w:t>
       </w:r>
       <w:r>
-        <w:t xml:space="preserve"> est une méthode redoutable pour accélérer l'adaptation à de nouvelles dynamiques, bien qu'elle puisse enfermer l'agent dans des optima locaux si l'environnement subit un changement topologique trop brusque (obstacles). L'échec de la généralisation sur plusieurs moutons souligne une leçon fondamentale : la puissance d'un algorithme est intimement liée à la qualité de sa représentation de l'état (</w:t>
+        <w:t xml:space="preserve"> non plus sur la topologie de l'environnement, mais sur la </w:t>
       </w:r>
       <w:r>
         <w:rPr>
-          <w:i/>
-          <w:iCs/>
+          <w:b/>
+          <w:bCs/>
         </w:rPr>
-        <w:t xml:space="preserve">State </w:t>
-      </w:r>
-      <w:proofErr w:type="spellStart"/>
-      <w:r>
-        <w:rPr>
-          <w:i/>
-          <w:iCs/>
-        </w:rPr>
-        <w:t>Representation</w:t>
-      </w:r>
-      <w:proofErr w:type="spellEnd"/>
-      <w:r>
-        <w:t>). Pour résoudre efficacement le problème du troupeau, il serait impératif de repenser le vecteur d'observation en y intégrant des métriques collectives (centre de gravité, rayon de dispersion).</w:t>
-      </w:r>
-    </w:p>
-    <w:p/>
-    <w:p/>
-    <w:p>
-      <w:pPr>
-        <w:pStyle w:val="Titre4"/>
-      </w:pPr>
-      <w:r>
-        <w:t xml:space="preserve">Perspectives et Améliorations Futures </w:t>
+        <w:t>précision de la tâche</w:t>
+      </w:r>
+      <w:r>
+        <w:t>.</w:t>
       </w:r>
     </w:p>
     <w:p/>
     <w:p>
       <w:r>
-        <w:t xml:space="preserve">Outre la refonte du vecteur d'observation, une piste d'optimisation très prometteuse consisterait à appliquer la logique du </w:t>
-      </w:r>
-      <w:r>
-        <w:rPr>
-          <w:i/>
-          <w:iCs/>
-        </w:rPr>
-        <w:t>Curriculum Learning</w:t>
-      </w:r>
-      <w:r>
-        <w:t xml:space="preserve"> non plus sur la topologie de l'environnement, mais sur la </w:t>
-      </w:r>
-      <w:r>
-        <w:rPr>
-          <w:i/>
-          <w:iCs/>
-        </w:rPr>
-        <w:t>précision de la tâche</w:t>
-      </w:r>
-      <w:r>
-        <w:t xml:space="preserve">. En réduisant progressivement le rayon de la zone cible (le </w:t>
+        <w:t xml:space="preserve">En réduisant progressivement le rayon de la zone cible (le </w:t>
       </w:r>
       <w:r>
         <w:rPr>
@@ -2627,12 +2010,12 @@
         <w:t>goal</w:t>
       </w:r>
       <w:r>
-        <w:t>) au fil des itérations d'entraînement, nous pourrions forcer l'agent à affiner sa politique de contrôle continu. Cette approche de spécialisation progressive permettrait de guider l'intelligence artificielle d'un comportement de rassemblement global vers un contrôle de haute précision, aboutissant à un agent capable de guider le troupeau vers un enclos restreint avec une précision millimétrique.</w:t>
+        <w:t>) au fil des itérations d'entraînement, nous pourrions forcer l'agent à affiner sa politique de contrôle continu. Cette approche de spécialisation progressive permettrait de guider l'intelligence artificielle d'un comportement de rassemblement global vers un contrôle de haute précision, aboutissant à un agent capable de guider le troupeau vers un enclos de taille très restreinte avec une précision millimétrique.</w:t>
       </w:r>
     </w:p>
     <w:sectPr>
-      <w:footerReference w:type="even" r:id="rId15"/>
-      <w:footerReference w:type="default" r:id="rId16"/>
+      <w:footerReference w:type="even" r:id="rId16"/>
+      <w:footerReference w:type="default" r:id="rId17"/>
       <w:pgSz w:w="11906" w:h="16838" w:code="9"/>
       <w:pgMar w:top="720" w:right="624" w:bottom="1077" w:left="624" w:header="709" w:footer="431" w:gutter="0"/>
       <w:cols w:space="708"/>
@@ -2815,17 +2198,15 @@
         <w:p>
           <w:pPr>
             <w:pStyle w:val="Pieddepage"/>
+            <w:rPr>
+              <w:lang w:val="en-GB"/>
+            </w:rPr>
           </w:pPr>
           <w:r>
-            <w:t xml:space="preserve">Projet Deep RL : </w:t>
-          </w:r>
-          <w:proofErr w:type="spellStart"/>
-          <w:r>
-            <w:t>Shepherding</w:t>
-          </w:r>
-          <w:proofErr w:type="spellEnd"/>
-          <w:r>
-            <w:t xml:space="preserve"> – Arthur Lecureur</w:t>
+            <w:rPr>
+              <w:lang w:val="en-GB"/>
+            </w:rPr>
+            <w:t>Projet Deep RL : Shepherding – Arthur Lecureur</w:t>
           </w:r>
         </w:p>
       </w:tc>
@@ -2836,6 +2217,9 @@
         <w:p>
           <w:pPr>
             <w:pStyle w:val="Pieddepage"/>
+            <w:rPr>
+              <w:lang w:val="en-GB"/>
+            </w:rPr>
           </w:pPr>
         </w:p>
       </w:tc>
@@ -2844,6 +2228,9 @@
   <w:p>
     <w:pPr>
       <w:pStyle w:val="Pieddepage"/>
+      <w:rPr>
+        <w:lang w:val="en-GB"/>
+      </w:rPr>
     </w:pPr>
   </w:p>
 </w:ftr>
@@ -3757,11 +3144,13 @@
     <w:rsidRoot w:val="00707C7F"/>
     <w:rsid w:val="000C2B5E"/>
     <w:rsid w:val="001A3AFD"/>
+    <w:rsid w:val="00580A77"/>
     <w:rsid w:val="006B2981"/>
     <w:rsid w:val="006C7821"/>
     <w:rsid w:val="006E53DE"/>
     <w:rsid w:val="00707C7F"/>
     <w:rsid w:val="00776F68"/>
+    <w:rsid w:val="008725E7"/>
     <w:rsid w:val="009829F8"/>
   </w:rsids>
   <m:mathPr>
@@ -5397,24 +4786,6 @@
 </file>
 
 <file path=customXml/item1.xml><?xml version="1.0" encoding="utf-8"?>
-<?mso-contentType ?>
-<FormTemplates xmlns="http://schemas.microsoft.com/sharepoint/v3/contenttype/forms">
-  <Display>DocumentLibraryForm</Display>
-  <Edit>DocumentLibraryForm</Edit>
-  <New>DocumentLibraryForm</New>
-</FormTemplates>
-</file>
-
-<file path=customXml/item2.xml><?xml version="1.0" encoding="utf-8"?>
-<p:properties xmlns:p="http://schemas.microsoft.com/office/2006/metadata/properties" xmlns:xsi="http://www.w3.org/2001/XMLSchema-instance" xmlns:pc="http://schemas.microsoft.com/office/infopath/2007/PartnerControls">
-  <documentManagement>
-    <Status xmlns="71af3243-3dd4-4a8d-8c0d-dd76da1f02a5">Not started</Status>
-    <MediaServiceKeyPoints xmlns="71af3243-3dd4-4a8d-8c0d-dd76da1f02a5" xsi:nil="true"/>
-  </documentManagement>
-</p:properties>
-</file>
-
-<file path=customXml/item3.xml><?xml version="1.0" encoding="utf-8"?>
 <ct:contentTypeSchema xmlns:ct="http://schemas.microsoft.com/office/2006/metadata/contentType" xmlns:ma="http://schemas.microsoft.com/office/2006/metadata/properties/metaAttributes" ct:_="" ma:_="" ma:contentTypeName="Document" ma:contentTypeID="0x01010079F111ED35F8CC479449609E8A0923A6" ma:contentTypeVersion="12" ma:contentTypeDescription="Create a new document." ma:contentTypeScope="" ma:versionID="fa6e671f1cd7e4d96ff9652be322dd5e">
   <xsd:schema xmlns:xsd="http://www.w3.org/2001/XMLSchema" xmlns:xs="http://www.w3.org/2001/XMLSchema" xmlns:p="http://schemas.microsoft.com/office/2006/metadata/properties" xmlns:ns2="71af3243-3dd4-4a8d-8c0d-dd76da1f02a5" xmlns:ns3="16c05727-aa75-4e4a-9b5f-8a80a1165891" targetNamespace="http://schemas.microsoft.com/office/2006/metadata/properties" ma:root="true" ma:fieldsID="4e2496f70b101db0b8013f30a071bbf7" ns2:_="" ns3:_="">
     <xsd:import namespace="71af3243-3dd4-4a8d-8c0d-dd76da1f02a5"/>
@@ -5635,25 +5006,25 @@
 </ct:contentTypeSchema>
 </file>
 
-<file path=customXml/itemProps1.xml><?xml version="1.0" encoding="utf-8"?>
-<ds:datastoreItem xmlns:ds="http://schemas.openxmlformats.org/officeDocument/2006/customXml" ds:itemID="{EF425F07-5221-4468-81DD-0F0C28E7FD98}">
-  <ds:schemaRefs>
-    <ds:schemaRef ds:uri="http://schemas.microsoft.com/sharepoint/v3/contenttype/forms"/>
-  </ds:schemaRefs>
-</ds:datastoreItem>
+<file path=customXml/item2.xml><?xml version="1.0" encoding="utf-8"?>
+<p:properties xmlns:p="http://schemas.microsoft.com/office/2006/metadata/properties" xmlns:xsi="http://www.w3.org/2001/XMLSchema-instance" xmlns:pc="http://schemas.microsoft.com/office/infopath/2007/PartnerControls">
+  <documentManagement>
+    <Status xmlns="71af3243-3dd4-4a8d-8c0d-dd76da1f02a5">Not started</Status>
+    <MediaServiceKeyPoints xmlns="71af3243-3dd4-4a8d-8c0d-dd76da1f02a5" xsi:nil="true"/>
+  </documentManagement>
+</p:properties>
 </file>
 
-<file path=customXml/itemProps2.xml><?xml version="1.0" encoding="utf-8"?>
-<ds:datastoreItem xmlns:ds="http://schemas.openxmlformats.org/officeDocument/2006/customXml" ds:itemID="{57798B56-5215-4AD8-847F-8A1F1C10FD6F}">
-  <ds:schemaRefs>
-    <ds:schemaRef ds:uri="http://schemas.microsoft.com/office/2006/metadata/properties"/>
-    <ds:schemaRef ds:uri="http://schemas.microsoft.com/office/infopath/2007/PartnerControls"/>
-    <ds:schemaRef ds:uri="71af3243-3dd4-4a8d-8c0d-dd76da1f02a5"/>
-  </ds:schemaRefs>
-</ds:datastoreItem>
+<file path=customXml/item3.xml><?xml version="1.0" encoding="utf-8"?>
+<?mso-contentType ?>
+<FormTemplates xmlns="http://schemas.microsoft.com/sharepoint/v3/contenttype/forms">
+  <Display>DocumentLibraryForm</Display>
+  <Edit>DocumentLibraryForm</Edit>
+  <New>DocumentLibraryForm</New>
+</FormTemplates>
 </file>
 
-<file path=customXml/itemProps3.xml><?xml version="1.0" encoding="utf-8"?>
+<file path=customXml/itemProps1.xml><?xml version="1.0" encoding="utf-8"?>
 <ds:datastoreItem xmlns:ds="http://schemas.openxmlformats.org/officeDocument/2006/customXml" ds:itemID="{507D20CB-E94B-44E8-97C3-44BC9C1AF38A}">
   <ds:schemaRefs>
     <ds:schemaRef ds:uri="http://schemas.microsoft.com/office/2006/metadata/contentType"/>
@@ -5670,4 +5041,22 @@
     <ds:schemaRef ds:uri="http://schemas.microsoft.com/internal/obd"/>
   </ds:schemaRefs>
 </ds:datastoreItem>
+</file>
+
+<file path=customXml/itemProps2.xml><?xml version="1.0" encoding="utf-8"?>
+<ds:datastoreItem xmlns:ds="http://schemas.openxmlformats.org/officeDocument/2006/customXml" ds:itemID="{57798B56-5215-4AD8-847F-8A1F1C10FD6F}">
+  <ds:schemaRefs>
+    <ds:schemaRef ds:uri="http://schemas.microsoft.com/office/2006/metadata/properties"/>
+    <ds:schemaRef ds:uri="http://schemas.microsoft.com/office/infopath/2007/PartnerControls"/>
+    <ds:schemaRef ds:uri="71af3243-3dd4-4a8d-8c0d-dd76da1f02a5"/>
+  </ds:schemaRefs>
+</ds:datastoreItem>
+</file>
+
+<file path=customXml/itemProps3.xml><?xml version="1.0" encoding="utf-8"?>
+<ds:datastoreItem xmlns:ds="http://schemas.openxmlformats.org/officeDocument/2006/customXml" ds:itemID="{EF425F07-5221-4468-81DD-0F0C28E7FD98}">
+  <ds:schemaRefs>
+    <ds:schemaRef ds:uri="http://schemas.microsoft.com/sharepoint/v3/contenttype/forms"/>
+  </ds:schemaRefs>
+</ds:datastoreItem>
 </file>
</xml_diff>

<commit_message>
Update project report with video link and minor text corrections
</commit_message>
<xml_diff>
--- a/Rapport.docx
+++ b/Rapport.docx
@@ -85,7 +85,7 @@
       </w:tr>
       <w:tr>
         <w:trPr>
-          <w:trHeight w:val="7080"/>
+          <w:trHeight w:val="5540"/>
         </w:trPr>
         <w:tc>
           <w:tcPr>
@@ -117,13 +117,13 @@
               <mc:AlternateContent>
                 <mc:Choice Requires="wpg">
                   <w:drawing>
-                    <wp:anchor distT="0" distB="0" distL="114300" distR="114300" simplePos="0" relativeHeight="251659264" behindDoc="1" locked="0" layoutInCell="1" allowOverlap="1" wp14:anchorId="787179B4" wp14:editId="09E02A47">
+                    <wp:anchor distT="0" distB="0" distL="114300" distR="114300" simplePos="0" relativeHeight="251659264" behindDoc="1" locked="0" layoutInCell="1" allowOverlap="1" wp14:anchorId="787179B4" wp14:editId="07A8655A">
                       <wp:simplePos x="0" y="0"/>
                       <wp:positionH relativeFrom="margin">
-                        <wp:posOffset>-4548505</wp:posOffset>
+                        <wp:posOffset>-4627410</wp:posOffset>
                       </wp:positionH>
                       <wp:positionV relativeFrom="page">
-                        <wp:posOffset>-2330450</wp:posOffset>
+                        <wp:posOffset>-2712085</wp:posOffset>
                       </wp:positionV>
                       <wp:extent cx="7772400" cy="10687050"/>
                       <wp:effectExtent l="0" t="0" r="0" b="0"/>
@@ -332,7 +332,7 @@
                 </mc:Choice>
                 <mc:Fallback>
                   <w:pict>
-                    <v:group w14:anchorId="0AA902B0" id="Groupe 1" o:spid="_x0000_s1026" style="position:absolute;margin-left:-358.15pt;margin-top:-183.5pt;width:612pt;height:841.5pt;z-index:-251657216;mso-position-horizontal-relative:margin;mso-position-vertical-relative:page;mso-width-relative:margin;mso-height-relative:margin" coordsize="77711,100533" o:gfxdata="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">
+                    <v:group w14:anchorId="4A1C8AC5" id="Groupe 1" o:spid="_x0000_s1026" style="position:absolute;margin-left:-364.35pt;margin-top:-213.55pt;width:612pt;height:841.5pt;z-index:-251657216;mso-position-horizontal-relative:margin;mso-position-vertical-relative:page;mso-width-relative:margin;mso-height-relative:margin" coordsize="77711,100533" o:gfxdata="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">
                       <v:shape id="Forme" o:spid="_x0000_s1027" style="position:absolute;top:25527;width:58458;height:75006;visibility:visible;mso-wrap-style:square;v-text-anchor:middle" coordsize="21600,21600" o:gfxdata="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" path="m,10687l,21600r1769,l21600,6148,13712,,,10687xe" fillcolor="#d8d8d8 [2732]" stroked="f" strokeweight="1pt">
                         <v:stroke miterlimit="4" joinstyle="miter"/>
                         <v:path arrowok="t" o:extrusionok="f" o:connecttype="custom" o:connectlocs="2922906,3750311;2922906,3750311;2922906,3750311;2922906,3750311" o:connectangles="0,90,180,270"/>
@@ -415,7 +415,7 @@
       </w:tr>
       <w:tr>
         <w:trPr>
-          <w:trHeight w:val="3302"/>
+          <w:trHeight w:val="3712"/>
         </w:trPr>
         <w:tc>
           <w:tcPr>
@@ -469,30 +469,12 @@
                 <w:noProof/>
               </w:rPr>
             </w:pPr>
-            <w:sdt>
-              <w:sdtPr>
-                <w:rPr>
-                  <w:noProof/>
-                </w:rPr>
-                <w:id w:val="1870268210"/>
-                <w:placeholder>
-                  <w:docPart w:val="64D5FE19A79E4FBBB93BDEFFD49DC7A0"/>
-                </w:placeholder>
-                <w:temporary/>
-                <w:showingPlcHdr/>
-                <w15:appearance w15:val="hidden"/>
-              </w:sdtPr>
-              <w:sdtContent>
-                <w:r>
-                  <w:rPr>
-                    <w:noProof/>
-                    <w:color w:val="008A90"/>
-                    <w:lang w:bidi="fr-FR"/>
-                  </w:rPr>
-                  <w:t>NOM DE L’ENSEIGNANT</w:t>
-                </w:r>
-              </w:sdtContent>
-            </w:sdt>
+            <w:r>
+              <w:rPr>
+                <w:noProof/>
+              </w:rPr>
+              <w:t>SHAMSI Meysam</w:t>
+            </w:r>
           </w:p>
           <w:p>
             <w:pPr>
@@ -516,6 +498,40 @@
               </w:rPr>
               <w:t xml:space="preserve"> </w:t>
             </w:r>
+            <w:hyperlink r:id="rId9" w:history="1">
+              <w:r>
+                <w:rPr>
+                  <w:rStyle w:val="Lienhypertexte"/>
+                  <w:i/>
+                  <w:iCs/>
+                </w:rPr>
+                <w:t>https://filesender.renater.fr/?s=download&amp;token=cb6390f6-8f36-412f-</w:t>
+              </w:r>
+              <w:r>
+                <w:rPr>
+                  <w:rStyle w:val="Lienhypertexte"/>
+                  <w:i/>
+                  <w:iCs/>
+                </w:rPr>
+                <w:t>9</w:t>
+              </w:r>
+              <w:r>
+                <w:rPr>
+                  <w:rStyle w:val="Lienhypertexte"/>
+                  <w:i/>
+                  <w:iCs/>
+                </w:rPr>
+                <w:t>fbf-6e9cbfd342bf</w:t>
+              </w:r>
+            </w:hyperlink>
+          </w:p>
+          <w:p>
+            <w:pPr>
+              <w:rPr>
+                <w:i/>
+                <w:iCs/>
+              </w:rPr>
+            </w:pPr>
           </w:p>
         </w:tc>
       </w:tr>
@@ -529,7 +545,8 @@
     </w:p>
     <w:tbl>
       <w:tblPr>
-        <w:tblW w:w="10666" w:type="dxa"/>
+        <w:tblW w:w="9981" w:type="dxa"/>
+        <w:tblInd w:w="284" w:type="dxa"/>
         <w:shd w:val="clear" w:color="auto" w:fill="EDF0F4" w:themeFill="accent3"/>
         <w:tblLayout w:type="fixed"/>
         <w:tblCellMar>
@@ -539,18 +556,21 @@
         <w:tblLook w:val="0600" w:firstRow="0" w:lastRow="0" w:firstColumn="0" w:lastColumn="0" w:noHBand="1" w:noVBand="1"/>
       </w:tblPr>
       <w:tblGrid>
-        <w:gridCol w:w="421"/>
-        <w:gridCol w:w="4912"/>
-        <w:gridCol w:w="4912"/>
-        <w:gridCol w:w="421"/>
+        <w:gridCol w:w="283"/>
+        <w:gridCol w:w="4766"/>
+        <w:gridCol w:w="4448"/>
+        <w:gridCol w:w="284"/>
+        <w:gridCol w:w="200"/>
       </w:tblGrid>
       <w:tr>
         <w:trPr>
+          <w:gridAfter w:val="1"/>
+          <w:wAfter w:w="200" w:type="dxa"/>
           <w:trHeight w:val="441"/>
         </w:trPr>
         <w:tc>
           <w:tcPr>
-            <w:tcW w:w="421" w:type="dxa"/>
+            <w:tcW w:w="283" w:type="dxa"/>
             <w:shd w:val="clear" w:color="auto" w:fill="EDF0F4" w:themeFill="accent3"/>
           </w:tcPr>
           <w:p>
@@ -563,7 +583,7 @@
         </w:tc>
         <w:tc>
           <w:tcPr>
-            <w:tcW w:w="4912" w:type="dxa"/>
+            <w:tcW w:w="4766" w:type="dxa"/>
             <w:shd w:val="clear" w:color="auto" w:fill="EDF0F4" w:themeFill="accent3"/>
           </w:tcPr>
           <w:p>
@@ -576,7 +596,7 @@
         </w:tc>
         <w:tc>
           <w:tcPr>
-            <w:tcW w:w="4912" w:type="dxa"/>
+            <w:tcW w:w="4448" w:type="dxa"/>
             <w:shd w:val="clear" w:color="auto" w:fill="EDF0F4" w:themeFill="accent3"/>
           </w:tcPr>
           <w:p>
@@ -589,7 +609,7 @@
         </w:tc>
         <w:tc>
           <w:tcPr>
-            <w:tcW w:w="421" w:type="dxa"/>
+            <w:tcW w:w="284" w:type="dxa"/>
             <w:shd w:val="clear" w:color="auto" w:fill="EDF0F4" w:themeFill="accent3"/>
           </w:tcPr>
           <w:p>
@@ -607,7 +627,7 @@
         </w:trPr>
         <w:tc>
           <w:tcPr>
-            <w:tcW w:w="421" w:type="dxa"/>
+            <w:tcW w:w="283" w:type="dxa"/>
             <w:shd w:val="clear" w:color="auto" w:fill="EDF0F4" w:themeFill="accent3"/>
           </w:tcPr>
           <w:p>
@@ -620,8 +640,8 @@
         </w:tc>
         <w:tc>
           <w:tcPr>
-            <w:tcW w:w="9824" w:type="dxa"/>
-            <w:gridSpan w:val="2"/>
+            <w:tcW w:w="9498" w:type="dxa"/>
+            <w:gridSpan w:val="3"/>
             <w:shd w:val="clear" w:color="auto" w:fill="EDF0F4" w:themeFill="accent3"/>
           </w:tcPr>
           <w:p>
@@ -721,28 +741,29 @@
                 <w:sz w:val="30"/>
                 <w:szCs w:val="30"/>
               </w:rPr>
-              <w:t xml:space="preserve">Afin de mener à bien nos expériences de manière rigoureuse, nous avons optimisé les scripts d’exécution (train.py et test.py) en y intégrant une gestion dynamique des hyperparamètres. Les modèles entraînés de zéro (Train from Scratch) ont bénéficié d’une phase d’apprentissage longue sur 2 000 000 de timesteps. Par ailleurs, nous avons automatisé la logique du Curriculum Learning (via un argument -cl) : cette méthode charge les poids du modèle précédent, réinitialise l’état de l’optimiseur pour favoriser une nouvelle exploration, et réduit la durée d’entraînement à 1 000 000 de timesteps, divisant ainsi notre empreinte de calcul par deux. </w:t>
-            </w:r>
-          </w:p>
-          <w:p>
-            <w:pPr>
+              <w:t xml:space="preserve">Afin de mener à bien nos expériences de manière rigoureuse, nous avons optimisé les scripts d’exécution (train.py et test.py) en y intégrant une gestion dynamique des hyperparamètres. Les modèles entraînés de zéro (Train </w:t>
+            </w:r>
+            <w:proofErr w:type="spellStart"/>
+            <w:r>
               <w:rPr>
                 <w:i/>
                 <w:iCs/>
                 <w:sz w:val="30"/>
                 <w:szCs w:val="30"/>
               </w:rPr>
-            </w:pPr>
-          </w:p>
-          <w:p>
-            <w:pPr>
+              <w:t>from</w:t>
+            </w:r>
+            <w:proofErr w:type="spellEnd"/>
+            <w:r>
               <w:rPr>
                 <w:i/>
                 <w:iCs/>
                 <w:sz w:val="30"/>
                 <w:szCs w:val="30"/>
               </w:rPr>
-            </w:pPr>
+              <w:t xml:space="preserve"> Scratch) ont bénéficié d’une phase d’apprentissage longue sur 2 000 000 de </w:t>
+            </w:r>
+            <w:proofErr w:type="spellStart"/>
             <w:r>
               <w:rPr>
                 <w:i/>
@@ -750,23 +771,162 @@
                 <w:sz w:val="30"/>
                 <w:szCs w:val="30"/>
               </w:rPr>
-              <w:t xml:space="preserve">Enfin, pour garantir la viabilité statistique de nos résultats (Sucess Rate, Average Reward, Average Duration) et en extraire l'écart-type (l'incertitude ±), les phases de test ont été systématiquement paramétrées pour s’exécuter sur une moyenne de 1000 épisodes (-n 1000). </w:t>
-            </w:r>
-          </w:p>
-          <w:p>
-            <w:pPr>
+              <w:t>timesteps</w:t>
+            </w:r>
+            <w:proofErr w:type="spellEnd"/>
+            <w:r>
               <w:rPr>
                 <w:i/>
                 <w:iCs/>
                 <w:sz w:val="30"/>
                 <w:szCs w:val="30"/>
               </w:rPr>
+              <w:t xml:space="preserve">. Par ailleurs, nous avons automatisé la logique du Curriculum Learning (via un argument -cl) : cette méthode charge les poids du modèle précédent, réinitialise l’état de l’optimiseur pour favoriser une nouvelle exploration, et réduit la durée d’entraînement à 1 000 000 de </w:t>
+            </w:r>
+            <w:proofErr w:type="spellStart"/>
+            <w:r>
+              <w:rPr>
+                <w:i/>
+                <w:iCs/>
+                <w:sz w:val="30"/>
+                <w:szCs w:val="30"/>
+              </w:rPr>
+              <w:t>timesteps</w:t>
+            </w:r>
+            <w:proofErr w:type="spellEnd"/>
+            <w:r>
+              <w:rPr>
+                <w:i/>
+                <w:iCs/>
+                <w:sz w:val="30"/>
+                <w:szCs w:val="30"/>
+              </w:rPr>
+              <w:t xml:space="preserve">, divisant ainsi notre empreinte de calcul par deux. </w:t>
+            </w:r>
+          </w:p>
+          <w:p>
+            <w:pPr>
+              <w:rPr>
+                <w:i/>
+                <w:iCs/>
+                <w:sz w:val="30"/>
+                <w:szCs w:val="30"/>
+              </w:rPr>
             </w:pPr>
           </w:p>
-        </w:tc>
-        <w:tc>
-          <w:tcPr>
-            <w:tcW w:w="421" w:type="dxa"/>
+          <w:p>
+            <w:pPr>
+              <w:rPr>
+                <w:i/>
+                <w:iCs/>
+                <w:sz w:val="30"/>
+                <w:szCs w:val="30"/>
+              </w:rPr>
+            </w:pPr>
+            <w:r>
+              <w:rPr>
+                <w:i/>
+                <w:iCs/>
+                <w:sz w:val="30"/>
+                <w:szCs w:val="30"/>
+              </w:rPr>
+              <w:t>Enfin, pour garantir la viabilité statistique de nos résultats (</w:t>
+            </w:r>
+            <w:proofErr w:type="spellStart"/>
+            <w:r>
+              <w:rPr>
+                <w:i/>
+                <w:iCs/>
+                <w:sz w:val="30"/>
+                <w:szCs w:val="30"/>
+              </w:rPr>
+              <w:t>Sucess</w:t>
+            </w:r>
+            <w:proofErr w:type="spellEnd"/>
+            <w:r>
+              <w:rPr>
+                <w:i/>
+                <w:iCs/>
+                <w:sz w:val="30"/>
+                <w:szCs w:val="30"/>
+              </w:rPr>
+              <w:t xml:space="preserve"> Rate, </w:t>
+            </w:r>
+            <w:proofErr w:type="spellStart"/>
+            <w:r>
+              <w:rPr>
+                <w:i/>
+                <w:iCs/>
+                <w:sz w:val="30"/>
+                <w:szCs w:val="30"/>
+              </w:rPr>
+              <w:t>Average</w:t>
+            </w:r>
+            <w:proofErr w:type="spellEnd"/>
+            <w:r>
+              <w:rPr>
+                <w:i/>
+                <w:iCs/>
+                <w:sz w:val="30"/>
+                <w:szCs w:val="30"/>
+              </w:rPr>
+              <w:t xml:space="preserve"> </w:t>
+            </w:r>
+            <w:proofErr w:type="spellStart"/>
+            <w:r>
+              <w:rPr>
+                <w:i/>
+                <w:iCs/>
+                <w:sz w:val="30"/>
+                <w:szCs w:val="30"/>
+              </w:rPr>
+              <w:t>Reward</w:t>
+            </w:r>
+            <w:proofErr w:type="spellEnd"/>
+            <w:r>
+              <w:rPr>
+                <w:i/>
+                <w:iCs/>
+                <w:sz w:val="30"/>
+                <w:szCs w:val="30"/>
+              </w:rPr>
+              <w:t xml:space="preserve">, </w:t>
+            </w:r>
+            <w:proofErr w:type="spellStart"/>
+            <w:r>
+              <w:rPr>
+                <w:i/>
+                <w:iCs/>
+                <w:sz w:val="30"/>
+                <w:szCs w:val="30"/>
+              </w:rPr>
+              <w:t>Average</w:t>
+            </w:r>
+            <w:proofErr w:type="spellEnd"/>
+            <w:r>
+              <w:rPr>
+                <w:i/>
+                <w:iCs/>
+                <w:sz w:val="30"/>
+                <w:szCs w:val="30"/>
+              </w:rPr>
+              <w:t xml:space="preserve"> Duration) et en extraire l'écart-type (l'incertitude), les phases de test ont été systématiquement paramétrées pour s’exécuter sur une moyenne de 1000 épisodes (-n 1000). </w:t>
+            </w:r>
+          </w:p>
+          <w:p>
+            <w:pPr>
+              <w:rPr>
+                <w:i/>
+                <w:iCs/>
+                <w:sz w:val="30"/>
+                <w:szCs w:val="30"/>
+              </w:rPr>
+            </w:pPr>
+          </w:p>
+        </w:tc>
+        <w:tc>
+          <w:tcPr>
+            <w:tcW w:w="200" w:type="dxa"/>
             <w:shd w:val="clear" w:color="auto" w:fill="EDF0F4" w:themeFill="accent3"/>
           </w:tcPr>
           <w:p>
@@ -955,7 +1115,15 @@
     <w:p/>
     <w:p>
       <w:r>
-        <w:t>Nous avons implémenté le mode active_sheep, qui redéfinit la règle de déplacement autonome des moutons selon la logique suivante :</w:t>
+        <w:t xml:space="preserve">Nous avons implémenté le mode </w:t>
+      </w:r>
+      <w:proofErr w:type="spellStart"/>
+      <w:r>
+        <w:t>active_sheep</w:t>
+      </w:r>
+      <w:proofErr w:type="spellEnd"/>
+      <w:r>
+        <w:t>, qui redéfinit la règle de déplacement autonome des moutons selon la logique suivante :</w:t>
       </w:r>
     </w:p>
     <w:p/>
@@ -983,7 +1151,7 @@
                     <pic:cNvPicPr/>
                   </pic:nvPicPr>
                   <pic:blipFill>
-                    <a:blip r:embed="rId9"/>
+                    <a:blip r:embed="rId10"/>
                     <a:stretch>
                       <a:fillRect/>
                     </a:stretch>
@@ -1011,13 +1179,42 @@
     </w:p>
     <w:p>
       <w:r>
-        <w:t>Dans la version initiale (exclusivement utilisée pour le Niveau 1), les moutons étaient purement "réactifs" : ils restaient totalement immobiles tant que le chien de berger n'entrait pas dans leur rayon d'action. Bien que parfaite pour initier l'agent aux mécaniques de base, cette logique manquait de réalisme. L'ajout de ce comportement stochastique (elif self.active_sheep) permet d'introduire un bruit permanent. Lorsque l'agent s'éloigne, les moutons non surveillés commencent à dériver de manière aléatoire, simulant de manière beaucoup plus fidèle le comportement d'un véritable troupeau. Cette modification est fondamentale pour justifier les Niveaux 2 et 3, car elle force l'intelligence artificielle à anticiper et corriger en temps réel les trajectoires d'entités mobiles, augmentant significativement la difficulté de la tâche.</w:t>
+        <w:t>Dans la version initiale (exclusivement utilisée pour le Niveau 1), les moutons étaient purement "réactifs" : ils restaient totalement immobiles tant que le chien de berger n'entrait pas dans leur rayon d'action. Bien que parfaite pour initier l'agent aux mécaniques de base, cette logique manquait de réalisme. L'ajout de ce comportement stochastique (</w:t>
+      </w:r>
+      <w:proofErr w:type="spellStart"/>
+      <w:r>
+        <w:t>elif</w:t>
+      </w:r>
+      <w:proofErr w:type="spellEnd"/>
+      <w:r>
+        <w:t xml:space="preserve"> </w:t>
+      </w:r>
+      <w:proofErr w:type="spellStart"/>
+      <w:proofErr w:type="gramStart"/>
+      <w:r>
+        <w:t>self.active</w:t>
+      </w:r>
+      <w:proofErr w:type="gramEnd"/>
+      <w:r>
+        <w:t>_sheep</w:t>
+      </w:r>
+      <w:proofErr w:type="spellEnd"/>
+      <w:r>
+        <w:t>) permet d'introduire un bruit permanent. Lorsque l'agent s'éloigne, les moutons non surveillés commencent à dériver de manière aléatoire, simulant de manière beaucoup plus fidèle le comportement d'un véritable troupeau. Cette modification est fondamentale pour justifier les Niveaux 2 et 3, car elle force l'intelligence artificielle à anticiper et corriger en temps réel les trajectoires d'entités mobiles, augmentant significativement la difficulté de la tâche.</w:t>
       </w:r>
     </w:p>
     <w:p/>
     <w:p>
       <w:r>
-        <w:t xml:space="preserve">Afin de valider la viabilité physique de ces environnements, nous avons d’abord évalué trois comportements de références (Baselines). Le tableau ci-dessous regroupe l'ensemble des métriques de référence pour le </w:t>
+        <w:t>Afin de valider la viabilité physique de ces environnements, nous avons d’abord évalué trois comportements de références (</w:t>
+      </w:r>
+      <w:proofErr w:type="spellStart"/>
+      <w:r>
+        <w:t>Baselines</w:t>
+      </w:r>
+      <w:proofErr w:type="spellEnd"/>
+      <w:r>
+        <w:t xml:space="preserve">). Le tableau ci-dessous regroupe l'ensemble des métriques de référence pour le </w:t>
       </w:r>
       <w:r>
         <w:rPr>
@@ -1038,11 +1235,11 @@
         <w:tblLook w:val="04A0" w:firstRow="1" w:lastRow="0" w:firstColumn="1" w:lastColumn="0" w:noHBand="0" w:noVBand="1"/>
       </w:tblPr>
       <w:tblGrid>
-        <w:gridCol w:w="2129"/>
-        <w:gridCol w:w="2129"/>
-        <w:gridCol w:w="2130"/>
-        <w:gridCol w:w="2130"/>
-        <w:gridCol w:w="2130"/>
+        <w:gridCol w:w="1964"/>
+        <w:gridCol w:w="1916"/>
+        <w:gridCol w:w="1924"/>
+        <w:gridCol w:w="1919"/>
+        <w:gridCol w:w="2013"/>
       </w:tblGrid>
       <w:tr>
         <w:tc>
@@ -1070,9 +1267,19 @@
             <w:tcW w:w="2130" w:type="dxa"/>
           </w:tcPr>
           <w:p>
-            <w:r>
-              <w:t>Average Reward</w:t>
-            </w:r>
+            <w:proofErr w:type="spellStart"/>
+            <w:r>
+              <w:t>Average</w:t>
+            </w:r>
+            <w:proofErr w:type="spellEnd"/>
+            <w:r>
+              <w:t xml:space="preserve"> </w:t>
+            </w:r>
+            <w:proofErr w:type="spellStart"/>
+            <w:r>
+              <w:t>Reward</w:t>
+            </w:r>
+            <w:proofErr w:type="spellEnd"/>
           </w:p>
         </w:tc>
         <w:tc>
@@ -1080,8 +1287,13 @@
             <w:tcW w:w="2130" w:type="dxa"/>
           </w:tcPr>
           <w:p>
-            <w:r>
-              <w:t>Averag Episode Length</w:t>
+            <w:proofErr w:type="spellStart"/>
+            <w:r>
+              <w:t>Averag</w:t>
+            </w:r>
+            <w:proofErr w:type="spellEnd"/>
+            <w:r>
+              <w:t xml:space="preserve"> Episode Length</w:t>
             </w:r>
           </w:p>
         </w:tc>
@@ -1133,8 +1345,13 @@
           </w:tcPr>
           <w:p>
             <w:r>
-              <w:t>31.7 steps</w:t>
-            </w:r>
+              <w:t xml:space="preserve">31.7 </w:t>
+            </w:r>
+            <w:proofErr w:type="spellStart"/>
+            <w:r>
+              <w:t>steps</w:t>
+            </w:r>
+            <w:proofErr w:type="spellEnd"/>
           </w:p>
         </w:tc>
         <w:tc>
@@ -1154,9 +1371,11 @@
             <w:tcW w:w="2129" w:type="dxa"/>
           </w:tcPr>
           <w:p>
+            <w:proofErr w:type="spellStart"/>
             <w:r>
               <w:t>Lazy</w:t>
             </w:r>
+            <w:proofErr w:type="spellEnd"/>
           </w:p>
         </w:tc>
         <w:tc>
@@ -1185,8 +1404,13 @@
           </w:tcPr>
           <w:p>
             <w:r>
-              <w:t>450.2 steps</w:t>
-            </w:r>
+              <w:t xml:space="preserve">450.2 </w:t>
+            </w:r>
+            <w:proofErr w:type="spellStart"/>
+            <w:r>
+              <w:t>steps</w:t>
+            </w:r>
+            <w:proofErr w:type="spellEnd"/>
           </w:p>
         </w:tc>
         <w:tc>
@@ -1206,9 +1430,11 @@
             <w:tcW w:w="2129" w:type="dxa"/>
           </w:tcPr>
           <w:p>
+            <w:proofErr w:type="spellStart"/>
             <w:r>
               <w:t>Tipsy</w:t>
             </w:r>
+            <w:proofErr w:type="spellEnd"/>
           </w:p>
         </w:tc>
         <w:tc>
@@ -1237,8 +1463,13 @@
           </w:tcPr>
           <w:p>
             <w:r>
-              <w:t>463.6 steps</w:t>
-            </w:r>
+              <w:t xml:space="preserve">463.6 </w:t>
+            </w:r>
+            <w:proofErr w:type="spellStart"/>
+            <w:r>
+              <w:t>steps</w:t>
+            </w:r>
+            <w:proofErr w:type="spellEnd"/>
           </w:p>
         </w:tc>
         <w:tc>
@@ -1289,8 +1520,13 @@
           </w:tcPr>
           <w:p>
             <w:r>
-              <w:t>214.36 steps</w:t>
-            </w:r>
+              <w:t xml:space="preserve">214.36 </w:t>
+            </w:r>
+            <w:proofErr w:type="spellStart"/>
+            <w:r>
+              <w:t>steps</w:t>
+            </w:r>
+            <w:proofErr w:type="spellEnd"/>
           </w:p>
         </w:tc>
         <w:tc>
@@ -1341,8 +1577,13 @@
           </w:tcPr>
           <w:p>
             <w:r>
-              <w:t>410.3 steps</w:t>
-            </w:r>
+              <w:t xml:space="preserve">410.3 </w:t>
+            </w:r>
+            <w:proofErr w:type="spellStart"/>
+            <w:r>
+              <w:t>steps</w:t>
+            </w:r>
+            <w:proofErr w:type="spellEnd"/>
           </w:p>
         </w:tc>
         <w:tc>
@@ -1393,8 +1634,13 @@
           </w:tcPr>
           <w:p>
             <w:r>
-              <w:t>425.1 steps</w:t>
-            </w:r>
+              <w:t xml:space="preserve">425.1 </w:t>
+            </w:r>
+            <w:proofErr w:type="spellStart"/>
+            <w:r>
+              <w:t>steps</w:t>
+            </w:r>
+            <w:proofErr w:type="spellEnd"/>
           </w:p>
         </w:tc>
         <w:tc>
@@ -1412,7 +1658,39 @@
     <w:p/>
     <w:p>
       <w:r>
-        <w:t>A l’inverse, notre algorithme expert codé en dur ( Rule-Based ) valide parfaitement la logique de l’environnement, atteignant un taux de réussite de 100 avec un mouton, et de 94% avec trois moutons. Les modèles Lazy (immobile) et Tipsy (mouvement aléatoire) affichent des taux de succès marginaux (10% à 20%), confirmant qu’une stratégie intelligente est indispensable. L'ajout des barres d'erreur (±) sur nos graphiques permet désormais d'attester de la stabilité de ces résultats.</w:t>
+        <w:t xml:space="preserve">A l’inverse, notre algorithme expert codé en dur </w:t>
+      </w:r>
+      <w:proofErr w:type="gramStart"/>
+      <w:r>
+        <w:t>( Rule</w:t>
+      </w:r>
+      <w:proofErr w:type="gramEnd"/>
+      <w:r>
+        <w:t>-</w:t>
+      </w:r>
+      <w:proofErr w:type="gramStart"/>
+      <w:r>
+        <w:t>Based )</w:t>
+      </w:r>
+      <w:proofErr w:type="gramEnd"/>
+      <w:r>
+        <w:t xml:space="preserve"> valide parfaitement la logique de l’environnement, atteignant un taux de réussite de 100 avec un mouton, et de 94% avec trois moutons. Les modèles </w:t>
+      </w:r>
+      <w:proofErr w:type="spellStart"/>
+      <w:r>
+        <w:t>Lazy</w:t>
+      </w:r>
+      <w:proofErr w:type="spellEnd"/>
+      <w:r>
+        <w:t xml:space="preserve"> (immobile) et </w:t>
+      </w:r>
+      <w:proofErr w:type="spellStart"/>
+      <w:r>
+        <w:t>Tipsy</w:t>
+      </w:r>
+      <w:proofErr w:type="spellEnd"/>
+      <w:r>
+        <w:t xml:space="preserve"> (mouvement aléatoire) affichent des taux de succès marginaux (10% à 20%), confirmant qu’une stratégie intelligente est indispensable. L'ajout des barres d'erreur (±) sur nos graphiques permet désormais d'attester de la stabilité de ces résultats.</w:t>
       </w:r>
     </w:p>
     <w:p/>
@@ -1424,6 +1702,7 @@
         <w:rPr>
           <w:noProof/>
         </w:rPr>
+        <w:lastRenderedPageBreak/>
         <w:drawing>
           <wp:inline distT="0" distB="0" distL="0" distR="0" wp14:anchorId="49DC077A" wp14:editId="4665E309">
             <wp:extent cx="4525231" cy="2715223"/>
@@ -1442,7 +1721,7 @@
                     </pic:cNvPicPr>
                   </pic:nvPicPr>
                   <pic:blipFill>
-                    <a:blip r:embed="rId10" cstate="print">
+                    <a:blip r:embed="rId11" cstate="print">
                       <a:extLst>
                         <a:ext uri="{28A0092B-C50C-407E-A947-70E740481C1C}">
                           <a14:useLocalDpi xmlns:a14="http://schemas.microsoft.com/office/drawing/2010/main" val="0"/>
@@ -1477,6 +1756,14 @@
     <w:p>
       <w:pPr>
         <w:jc w:val="center"/>
+      </w:pPr>
+      <w:r>
+        <w:t>Figure 1 : Comparaison des performances initiales (Niveau 1) avec incertitudes statistiques.</w:t>
+      </w:r>
+    </w:p>
+    <w:p>
+      <w:pPr>
+        <w:jc w:val="center"/>
         <w:rPr>
           <w:rFonts w:asciiTheme="majorHAnsi" w:eastAsiaTheme="majorEastAsia" w:hAnsiTheme="majorHAnsi" w:cstheme="majorBidi"/>
           <w:b/>
@@ -1484,19 +1771,12 @@
           <w:sz w:val="36"/>
         </w:rPr>
       </w:pPr>
-      <w:r>
-        <w:t>Figure 1 : Comparaison des performances initiales (Niveau 1) avec incertitudes statistiques.</w:t>
-      </w:r>
-      <w:r>
-        <w:br w:type="page"/>
-      </w:r>
     </w:p>
     <w:p>
       <w:pPr>
         <w:pStyle w:val="Titre3"/>
       </w:pPr>
       <w:r>
-        <w:lastRenderedPageBreak/>
         <w:t>Apprentissage et Curriculum (1 Mouton)</w:t>
       </w:r>
     </w:p>
@@ -1509,7 +1789,15 @@
     <w:p/>
     <w:p>
       <w:r>
-        <w:t>Le passage au Niveau 2 a été l’occasion de tester différentes méthodes de transfert d’apprentissage. Les résultats statistiques montrent que l'utilisation directe (Direct Use) du modèle PPO entraîné au Niveau 1 résiste excellemment bien au bruit stochastique, conservant un taux de succès de 60.7% ± 3.0%. L’approche par Curriculum Learning (fine-tuning du modèle statique sur le niveau dynamique) maintient une performance très robuste de 53.2% ± 3.1%, surpassant ainsi un entraînement repris entièrement de zéro (Train from Scratch, 48.5% ± 3.1%). De son côté, DQN reste incapable de dépasser les 26% de succès, confirmant les limites de l'approche visuelle sur des cibles erratiques.</w:t>
+        <w:t xml:space="preserve">Le passage au Niveau 2 a été l’occasion de tester différentes méthodes de transfert d’apprentissage. Les résultats statistiques montrent que l'utilisation directe (Direct Use) du modèle PPO entraîné au Niveau 1 résiste excellemment bien au bruit stochastique, conservant un taux de succès de 60.7% ± 3.0%. L’approche par Curriculum Learning (fine-tuning du modèle statique sur le niveau dynamique) maintient une performance très robuste de 53.2% ± 3.1%, surpassant ainsi un entraînement repris entièrement de zéro (Train </w:t>
+      </w:r>
+      <w:proofErr w:type="spellStart"/>
+      <w:r>
+        <w:t>from</w:t>
+      </w:r>
+      <w:proofErr w:type="spellEnd"/>
+      <w:r>
+        <w:t xml:space="preserve"> Scratch, 48.5% ± 3.1%). De son côté, DQN reste incapable de dépasser les 26% de succès, confirmant les limites de l'approche visuelle sur des cibles erratiques.</w:t>
       </w:r>
     </w:p>
     <w:p/>
@@ -1539,7 +1827,7 @@
                     </pic:cNvPicPr>
                   </pic:nvPicPr>
                   <pic:blipFill>
-                    <a:blip r:embed="rId11" cstate="print">
+                    <a:blip r:embed="rId12" cstate="print">
                       <a:extLst>
                         <a:ext uri="{28A0092B-C50C-407E-A947-70E740481C1C}">
                           <a14:useLocalDpi xmlns:a14="http://schemas.microsoft.com/office/drawing/2010/main" val="0"/>
@@ -1580,12 +1868,13 @@
       </w:r>
     </w:p>
     <w:p>
-      <w:pPr>
-        <w:jc w:val="center"/>
-      </w:pPr>
-    </w:p>
-    <w:p>
-      <w:r>
+      <w:r>
+        <w:br w:type="page"/>
+      </w:r>
+    </w:p>
+    <w:p>
+      <w:r>
+        <w:lastRenderedPageBreak/>
         <w:t>Cependant, face à l’introduction d’un obstacle géométrique (Niveau 3), la dynamique s’est inversée. Le modèle PPO entraîné depuis zéro (54.5% ± 3.1%) a surpassé le modèle issu du Curriculum Learning (46.3% ± 3.1%) et le Direct Use (qui chute à 44.2%). L’agent a en effet dû ‘désapprendre’ ses anciens réflexes de trajectoire en ligne droite pour assimiler sainement la notion de contournement. Un agent "vierge" a donc été avantagé face à cette nouvelle topologie.</w:t>
       </w:r>
     </w:p>
@@ -1616,7 +1905,7 @@
                     </pic:cNvPicPr>
                   </pic:nvPicPr>
                   <pic:blipFill>
-                    <a:blip r:embed="rId12" cstate="print">
+                    <a:blip r:embed="rId13" cstate="print">
                       <a:extLst>
                         <a:ext uri="{28A0092B-C50C-407E-A947-70E740481C1C}">
                           <a14:useLocalDpi xmlns:a14="http://schemas.microsoft.com/office/drawing/2010/main" val="0"/>
@@ -1655,16 +1944,17 @@
       <w:r>
         <w:t>Figure 3 : Impact de la méthode d'apprentissage face à un obstacle géométrique (Niveau 3).</w:t>
       </w:r>
-      <w:r>
-        <w:br w:type="page"/>
-      </w:r>
+    </w:p>
+    <w:p>
+      <w:pPr>
+        <w:jc w:val="center"/>
+      </w:pPr>
     </w:p>
     <w:p>
       <w:pPr>
         <w:pStyle w:val="Titre3"/>
       </w:pPr>
       <w:r>
-        <w:lastRenderedPageBreak/>
         <w:t>Le Défi de la Dimensionnalité (3 moutons)</w:t>
       </w:r>
     </w:p>
@@ -1677,7 +1967,15 @@
     <w:p/>
     <w:p>
       <w:r>
-        <w:t>Les modèles d’apprentissage profond (PPO et DQN) s’effondrent de manière drastique, plafonnant entre 1% et 5% de réussite sur tous les niveaux. En multipliant simplement les coordonnées d’entrée le réseau de neurones échoue a conceptualiser le groupe en tant qu’entité unique. L’agent tente alors d’interagir avec les moutons de manière isolée, ce qui disloque le troupeau.</w:t>
+        <w:t xml:space="preserve">Les modèles d’apprentissage profond (PPO et DQN) s’effondrent de manière drastique, plafonnant entre 1% et 5% de réussite sur tous les niveaux. En multipliant simplement les coordonnées d’entrée le réseau de neurones échoue </w:t>
+      </w:r>
+      <w:proofErr w:type="gramStart"/>
+      <w:r>
+        <w:t>a</w:t>
+      </w:r>
+      <w:proofErr w:type="gramEnd"/>
+      <w:r>
+        <w:t xml:space="preserve"> conceptualiser le groupe en tant qu’entité unique. L’agent tente alors d’interagir avec les moutons de manière isolée, ce qui disloque le troupeau.</w:t>
       </w:r>
     </w:p>
     <w:p/>
@@ -1707,7 +2005,7 @@
                     </pic:cNvPicPr>
                   </pic:nvPicPr>
                   <pic:blipFill>
-                    <a:blip r:embed="rId13" cstate="print">
+                    <a:blip r:embed="rId14" cstate="print">
                       <a:extLst>
                         <a:ext uri="{28A0092B-C50C-407E-A947-70E740481C1C}">
                           <a14:useLocalDpi xmlns:a14="http://schemas.microsoft.com/office/drawing/2010/main" val="0"/>
@@ -1757,6 +2055,7 @@
         <w:pStyle w:val="Titre3"/>
       </w:pPr>
       <w:r>
+        <w:lastRenderedPageBreak/>
         <w:t>Environnement Multi-Agent (Niveau 4)</w:t>
       </w:r>
     </w:p>
@@ -1766,7 +2065,15 @@
         <w:jc w:val="both"/>
       </w:pPr>
       <w:r>
-        <w:t>En raison des contraintes matérielles sévères et des temps de calcul particulièrement longs (jusqu'à 2,5 heures par modèle PPO sur 2 millions de steps), l'exploration poussée de l'environnement multi-agent impliquant plusieurs bergers simultanés (Niveau 4) n'a pas pu être menée à son terme. Nos ressources de calcul ont été priorisées sur l'extraction statistique rigoureuse sur 1000 épisodes, et l'optimisation comparative des modèles PPO et DQN sur les trois premiers niveaux.</w:t>
+        <w:t xml:space="preserve">En raison des contraintes matérielles sévères et des temps de calcul particulièrement longs (jusqu'à 2,5 heures par modèle PPO sur 2 millions de </w:t>
+      </w:r>
+      <w:proofErr w:type="spellStart"/>
+      <w:r>
+        <w:t>steps</w:t>
+      </w:r>
+      <w:proofErr w:type="spellEnd"/>
+      <w:r>
+        <w:t>), l'exploration poussée de l'environnement multi-agent impliquant plusieurs bergers simultanés (Niveau 4) n'a pas pu être menée à son terme. Nos ressources de calcul ont été priorisées sur l'extraction statistique rigoureuse sur 1000 épisodes, et l'optimisation comparative des modèles PPO et DQN sur les trois premiers niveaux.</w:t>
       </w:r>
     </w:p>
     <w:p/>
@@ -1810,7 +2117,7 @@
                     </pic:cNvPicPr>
                   </pic:nvPicPr>
                   <pic:blipFill>
-                    <a:blip r:embed="rId14" cstate="print">
+                    <a:blip r:embed="rId15" cstate="print">
                       <a:extLst>
                         <a:ext uri="{28A0092B-C50C-407E-A947-70E740481C1C}">
                           <a14:useLocalDpi xmlns:a14="http://schemas.microsoft.com/office/drawing/2010/main" val="0"/>
@@ -1852,7 +2159,6 @@
     </w:p>
     <w:p>
       <w:r>
-        <w:lastRenderedPageBreak/>
         <w:t>L'analyse de nos résultats est d'autant plus frappante lorsque l'on observe la distribution des récompenses moyennes avec leurs barres d'erreur (écart-type).</w:t>
       </w:r>
     </w:p>
@@ -1883,7 +2189,7 @@
                     </pic:cNvPicPr>
                   </pic:nvPicPr>
                   <pic:blipFill>
-                    <a:blip r:embed="rId15" cstate="print">
+                    <a:blip r:embed="rId16" cstate="print">
                       <a:extLst>
                         <a:ext uri="{28A0092B-C50C-407E-A947-70E740481C1C}">
                           <a14:useLocalDpi xmlns:a14="http://schemas.microsoft.com/office/drawing/2010/main" val="0"/>
@@ -1930,6 +2236,7 @@
     </w:p>
     <w:p>
       <w:r>
+        <w:lastRenderedPageBreak/>
         <w:t>Comme l'illustre la Figure 6, PPO obtient non seulement des scores plus élevés (barres bleues), mais l'amplitude de ses moustaches d'incertitude est beaucoup plus resserrée que celle de DQN, démontrant une stabilité comportementale nettement supérieure.</w:t>
       </w:r>
     </w:p>
@@ -1943,14 +2250,7 @@
           <w:i/>
           <w:iCs/>
         </w:rPr>
-        <w:t xml:space="preserve">State </w:t>
-      </w:r>
-      <w:r>
-        <w:rPr>
-          <w:i/>
-          <w:iCs/>
-        </w:rPr>
-        <w:t>Représentation</w:t>
+        <w:t>State Représentation</w:t>
       </w:r>
       <w:r>
         <w:t>. Pour résoudre ce problème à grande échelle, il serait impératif de fournir à l'agent des métriques collectives, telles que le centre de gravité et le rayon de dispersion du troupeau.</w:t>
@@ -1968,13 +2268,7 @@
     <w:p/>
     <w:p>
       <w:r>
-        <w:t xml:space="preserve">Outre la refonte du vecteur d'observation pour la gestion multi-agent abordée </w:t>
-      </w:r>
-      <w:r>
-        <w:t>précédemment,</w:t>
-      </w:r>
-      <w:r>
-        <w:t xml:space="preserve"> une piste d'optimisation très prometteuse consisterait à appliquer la logique du </w:t>
+        <w:t xml:space="preserve">Outre la refonte du vecteur d'observation pour la gestion multi-agent abordée précédemment, une piste d'optimisation très prometteuse consisterait à appliquer la logique du </w:t>
       </w:r>
       <w:r>
         <w:rPr>
@@ -2014,10 +2308,10 @@
       </w:r>
     </w:p>
     <w:sectPr>
-      <w:footerReference w:type="even" r:id="rId16"/>
-      <w:footerReference w:type="default" r:id="rId17"/>
+      <w:footerReference w:type="even" r:id="rId17"/>
+      <w:footerReference w:type="default" r:id="rId18"/>
       <w:pgSz w:w="11906" w:h="16838" w:code="9"/>
-      <w:pgMar w:top="720" w:right="624" w:bottom="1077" w:left="624" w:header="709" w:footer="431" w:gutter="0"/>
+      <w:pgMar w:top="1440" w:right="1080" w:bottom="1440" w:left="1080" w:header="709" w:footer="431" w:gutter="0"/>
       <w:cols w:space="708"/>
       <w:titlePg/>
       <w:docGrid w:linePitch="360"/>
@@ -2202,11 +2496,33 @@
               <w:lang w:val="en-GB"/>
             </w:rPr>
           </w:pPr>
+          <w:proofErr w:type="spellStart"/>
           <w:r>
             <w:rPr>
               <w:lang w:val="en-GB"/>
             </w:rPr>
-            <w:t>Projet Deep RL : Shepherding – Arthur Lecureur</w:t>
+            <w:t>Projet</w:t>
+          </w:r>
+          <w:proofErr w:type="spellEnd"/>
+          <w:r>
+            <w:rPr>
+              <w:lang w:val="en-GB"/>
+            </w:rPr>
+            <w:t xml:space="preserve"> Deep </w:t>
+          </w:r>
+          <w:proofErr w:type="gramStart"/>
+          <w:r>
+            <w:rPr>
+              <w:lang w:val="en-GB"/>
+            </w:rPr>
+            <w:t>RL :</w:t>
+          </w:r>
+          <w:proofErr w:type="gramEnd"/>
+          <w:r>
+            <w:rPr>
+              <w:lang w:val="en-GB"/>
+            </w:rPr>
+            <w:t xml:space="preserve"> Shepherding – Arthur Lecureur</w:t>
           </w:r>
         </w:p>
       </w:tc>
@@ -2763,6 +3079,7 @@
   <w:style w:type="character" w:default="1" w:styleId="Policepardfaut">
     <w:name w:val="Default Paragraph Font"/>
     <w:uiPriority w:val="1"/>
+    <w:semiHidden/>
     <w:unhideWhenUsed/>
   </w:style>
   <w:style w:type="table" w:default="1" w:styleId="TableauNormal">
@@ -3029,678 +3346,41 @@
       <w:sz w:val="70"/>
     </w:rPr>
   </w:style>
-</w:styles>
-</file>
-
-<file path=word/glossary/document.xml><?xml version="1.0" encoding="utf-8"?>
-<w:glossaryDocument xmlns:wpc="http://schemas.microsoft.com/office/word/2010/wordprocessingCanvas" xmlns:cx="http://schemas.microsoft.com/office/drawing/2014/chartex" xmlns:cx1="http://schemas.microsoft.com/office/drawing/2015/9/8/chartex" xmlns:cx2="http://schemas.microsoft.com/office/drawing/2015/10/21/chartex" xmlns:cx3="http://schemas.microsoft.com/office/drawing/2016/5/9/chartex" xmlns:cx4="http://schemas.microsoft.com/office/drawing/2016/5/10/chartex" xmlns:cx5="http://schemas.microsoft.com/office/drawing/2016/5/11/chartex" xmlns:cx6="http://schemas.microsoft.com/office/drawing/2016/5/12/chartex" xmlns:cx7="http://schemas.microsoft.com/office/drawing/2016/5/13/chartex" xmlns:cx8="http://schemas.microsoft.com/office/drawing/2016/5/14/chartex" xmlns:mc="http://schemas.openxmlformats.org/markup-compatibility/2006" xmlns:aink="http://schemas.microsoft.com/office/drawing/2016/ink" xmlns:am3d="http://schemas.microsoft.com/office/drawing/2017/model3d" xmlns:o="urn:schemas-microsoft-com:office:office" xmlns:oel="http://schemas.microsoft.com/office/2019/extlst" xmlns:r="http://schemas.openxmlformats.org/officeDocument/2006/relationships" xmlns:m="http://schemas.openxmlformats.org/officeDocument/2006/math" xmlns:v="urn:schemas-microsoft-com:vml" xmlns:wp14="http://schemas.microsoft.com/office/word/2010/wordprocessingDrawing" xmlns:wp="http://schemas.openxmlformats.org/drawingml/2006/wordprocessingDrawing" xmlns:w10="urn:schemas-microsoft-com:office:word" xmlns:w="http://schemas.openxmlformats.org/wordprocessingml/2006/main" xmlns:w14="http://schemas.microsoft.com/office/word/2010/wordml" xmlns:w15="http://schemas.microsoft.com/office/word/2012/wordml" xmlns:w16cex="http://schemas.microsoft.com/office/word/2018/wordml/cex" xmlns:w16cid="http://schemas.microsoft.com/office/word/2016/wordml/cid" xmlns:w16="http://schemas.microsoft.com/office/word/2018/wordml" xmlns:w16du="http://schemas.microsoft.com/office/word/2023/wordml/word16du" xmlns:w16sdtdh="http://schemas.microsoft.com/office/word/2020/wordml/sdtdatahash" xmlns:w16sdtfl="http://schemas.microsoft.com/office/word/2024/wordml/sdtformatlock" xmlns:w16se="http://schemas.microsoft.com/office/word/2015/wordml/symex" xmlns:wpg="http://schemas.microsoft.com/office/word/2010/wordprocessingGroup" xmlns:wpi="http://schemas.microsoft.com/office/word/2010/wordprocessingInk" xmlns:wne="http://schemas.microsoft.com/office/word/2006/wordml" xmlns:wps="http://schemas.microsoft.com/office/word/2010/wordprocessingShape" mc:Ignorable="w14 w15 w16se w16cid w16 w16cex w16sdtdh w16sdtfl w16du wp14">
-  <w:docParts>
-    <w:docPart>
-      <w:docPartPr>
-        <w:name w:val="64D5FE19A79E4FBBB93BDEFFD49DC7A0"/>
-        <w:category>
-          <w:name w:val="Général"/>
-          <w:gallery w:val="placeholder"/>
-        </w:category>
-        <w:types>
-          <w:type w:val="bbPlcHdr"/>
-        </w:types>
-        <w:behaviors>
-          <w:behavior w:val="content"/>
-        </w:behaviors>
-        <w:guid w:val="{ABDD9506-CEC8-405B-9451-0B45354646F0}"/>
-      </w:docPartPr>
-      <w:docPartBody>
-        <w:p>
-          <w:pPr>
-            <w:pStyle w:val="64D5FE19A79E4FBBB93BDEFFD49DC7A0"/>
-          </w:pPr>
-          <w:r>
-            <w:rPr>
-              <w:noProof/>
-              <w:lang w:bidi="fr-FR"/>
-            </w:rPr>
-            <w:t>NOM DE L’ENSEIGNANT</w:t>
-          </w:r>
-        </w:p>
-      </w:docPartBody>
-    </w:docPart>
-  </w:docParts>
-</w:glossaryDocument>
-</file>
-
-<file path=word/glossary/fontTable.xml><?xml version="1.0" encoding="utf-8"?>
-<w:fonts xmlns:mc="http://schemas.openxmlformats.org/markup-compatibility/2006" xmlns:r="http://schemas.openxmlformats.org/officeDocument/2006/relationships" xmlns:w="http://schemas.openxmlformats.org/wordprocessingml/2006/main" xmlns:w14="http://schemas.microsoft.com/office/word/2010/wordml" xmlns:w15="http://schemas.microsoft.com/office/word/2012/wordml" xmlns:w16cex="http://schemas.microsoft.com/office/word/2018/wordml/cex" xmlns:w16cid="http://schemas.microsoft.com/office/word/2016/wordml/cid" xmlns:w16="http://schemas.microsoft.com/office/word/2018/wordml" xmlns:w16du="http://schemas.microsoft.com/office/word/2023/wordml/word16du" xmlns:w16sdtdh="http://schemas.microsoft.com/office/word/2020/wordml/sdtdatahash" xmlns:w16sdtfl="http://schemas.microsoft.com/office/word/2024/wordml/sdtformatlock" xmlns:w16se="http://schemas.microsoft.com/office/word/2015/wordml/symex" mc:Ignorable="w14 w15 w16se w16cid w16 w16cex w16sdtdh w16sdtfl w16du">
-  <w:font w:name="Georgia">
-    <w:panose1 w:val="02040502050405020303"/>
-    <w:charset w:val="00"/>
-    <w:family w:val="roman"/>
-    <w:pitch w:val="variable"/>
-    <w:sig w:usb0="00000287" w:usb1="00000000" w:usb2="00000000" w:usb3="00000000" w:csb0="0000009F" w:csb1="00000000"/>
-  </w:font>
-  <w:font w:name="Times New Roman">
-    <w:panose1 w:val="02020603050405020304"/>
-    <w:charset w:val="00"/>
-    <w:family w:val="roman"/>
-    <w:pitch w:val="variable"/>
-    <w:sig w:usb0="E0002EFF" w:usb1="C000785B" w:usb2="00000009" w:usb3="00000000" w:csb0="000001FF" w:csb1="00000000"/>
-  </w:font>
-  <w:font w:name="Arial Black">
-    <w:panose1 w:val="020B0A04020102020204"/>
-    <w:charset w:val="00"/>
-    <w:family w:val="swiss"/>
-    <w:pitch w:val="variable"/>
-    <w:sig w:usb0="A00002AF" w:usb1="400078FB" w:usb2="00000000" w:usb3="00000000" w:csb0="0000009F" w:csb1="00000000"/>
-  </w:font>
-  <w:font w:name="SimHei">
-    <w:altName w:val="黑体"/>
-    <w:panose1 w:val="02010600030101010101"/>
-    <w:charset w:val="86"/>
-    <w:family w:val="modern"/>
-    <w:pitch w:val="fixed"/>
-    <w:sig w:usb0="800002BF" w:usb1="38CF7CFA" w:usb2="00000016" w:usb3="00000000" w:csb0="00040001" w:csb1="00000000"/>
-  </w:font>
-  <w:font w:name="SimSun">
-    <w:altName w:val="宋体"/>
-    <w:panose1 w:val="02010600030101010101"/>
-    <w:charset w:val="86"/>
-    <w:family w:val="auto"/>
-    <w:pitch w:val="variable"/>
-    <w:sig w:usb0="00000203" w:usb1="288F0000" w:usb2="00000016" w:usb3="00000000" w:csb0="00040001" w:csb1="00000000"/>
-  </w:font>
-  <w:font w:name="Calibri">
-    <w:panose1 w:val="020F0502020204030204"/>
-    <w:charset w:val="00"/>
-    <w:family w:val="swiss"/>
-    <w:pitch w:val="variable"/>
-    <w:sig w:usb0="E4002EFF" w:usb1="C200247B" w:usb2="00000009" w:usb3="00000000" w:csb0="000001FF" w:csb1="00000000"/>
-  </w:font>
-  <w:font w:name="Calibri Light">
-    <w:panose1 w:val="020F0302020204030204"/>
-    <w:charset w:val="00"/>
-    <w:family w:val="swiss"/>
-    <w:pitch w:val="variable"/>
-    <w:sig w:usb0="E4002EFF" w:usb1="C200247B" w:usb2="00000009" w:usb3="00000000" w:csb0="000001FF" w:csb1="00000000"/>
-  </w:font>
-</w:fonts>
-</file>
-
-<file path=word/glossary/settings.xml><?xml version="1.0" encoding="utf-8"?>
-<w:settings xmlns:mc="http://schemas.openxmlformats.org/markup-compatibility/2006" xmlns:o="urn:schemas-microsoft-com:office:office" xmlns:r="http://schemas.openxmlformats.org/officeDocument/2006/relationships" xmlns:m="http://schemas.openxmlformats.org/officeDocument/2006/math" xmlns:v="urn:schemas-microsoft-com:vml" xmlns:w10="urn:schemas-microsoft-com:office:word" xmlns:w="http://schemas.openxmlformats.org/wordprocessingml/2006/main" xmlns:w14="http://schemas.microsoft.com/office/word/2010/wordml" xmlns:w15="http://schemas.microsoft.com/office/word/2012/wordml" xmlns:w16cex="http://schemas.microsoft.com/office/word/2018/wordml/cex" xmlns:w16cid="http://schemas.microsoft.com/office/word/2016/wordml/cid" xmlns:w16="http://schemas.microsoft.com/office/word/2018/wordml" xmlns:w16du="http://schemas.microsoft.com/office/word/2023/wordml/word16du" xmlns:w16sdtdh="http://schemas.microsoft.com/office/word/2020/wordml/sdtdatahash" xmlns:w16sdtfl="http://schemas.microsoft.com/office/word/2024/wordml/sdtformatlock" xmlns:w16se="http://schemas.microsoft.com/office/word/2015/wordml/symex" xmlns:sl="http://schemas.openxmlformats.org/schemaLibrary/2006/main" mc:Ignorable="w14 w15 w16se w16cid w16 w16cex w16sdtdh w16sdtfl w16du">
-  <w:view w:val="normal"/>
-  <w:defaultTabStop w:val="708"/>
-  <w:hyphenationZone w:val="425"/>
-  <w:characterSpacingControl w:val="doNotCompress"/>
-  <w:compat>
-    <w:useFELayout/>
-    <w:compatSetting w:name="compatibilityMode" w:uri="http://schemas.microsoft.com/office/word" w:val="15"/>
-    <w:compatSetting w:name="overrideTableStyleFontSizeAndJustification" w:uri="http://schemas.microsoft.com/office/word" w:val="1"/>
-    <w:compatSetting w:name="enableOpenTypeFeatures" w:uri="http://schemas.microsoft.com/office/word" w:val="1"/>
-    <w:compatSetting w:name="doNotFlipMirrorIndents" w:uri="http://schemas.microsoft.com/office/word" w:val="1"/>
-    <w:compatSetting w:name="differentiateMultirowTableHeaders" w:uri="http://schemas.microsoft.com/office/word" w:val="1"/>
-    <w:compatSetting w:name="useWord2013TrackBottomHyphenation" w:uri="http://schemas.microsoft.com/office/word" w:val="0"/>
-  </w:compat>
-  <w:rsids>
-    <w:rsidRoot w:val="00707C7F"/>
-    <w:rsid w:val="000C2B5E"/>
-    <w:rsid w:val="001A3AFD"/>
-    <w:rsid w:val="00580A77"/>
-    <w:rsid w:val="006B2981"/>
-    <w:rsid w:val="006C7821"/>
-    <w:rsid w:val="006E53DE"/>
-    <w:rsid w:val="00707C7F"/>
-    <w:rsid w:val="00776F68"/>
-    <w:rsid w:val="008725E7"/>
-    <w:rsid w:val="009829F8"/>
-  </w:rsids>
-  <m:mathPr>
-    <m:mathFont m:val="Cambria Math"/>
-    <m:brkBin m:val="before"/>
-    <m:brkBinSub m:val="--"/>
-    <m:smallFrac m:val="0"/>
-    <m:dispDef/>
-    <m:lMargin m:val="0"/>
-    <m:rMargin m:val="0"/>
-    <m:defJc m:val="centerGroup"/>
-    <m:wrapIndent m:val="1440"/>
-    <m:intLim m:val="subSup"/>
-    <m:naryLim m:val="undOvr"/>
-  </m:mathPr>
-  <w:themeFontLang w:val="fr-FR"/>
-  <w:clrSchemeMapping w:bg1="light1" w:t1="dark1" w:bg2="light2" w:t2="dark2" w:accent1="accent1" w:accent2="accent2" w:accent3="accent3" w:accent4="accent4" w:accent5="accent5" w:accent6="accent6" w:hyperlink="hyperlink" w:followedHyperlink="followedHyperlink"/>
-  <w:decimalSymbol w:val=","/>
-  <w:listSeparator w:val=";"/>
-  <w15:chartTrackingRefBased/>
-</w:settings>
-</file>
-
-<file path=word/glossary/styles.xml><?xml version="1.0" encoding="utf-8"?>
-<w:styles xmlns:mc="http://schemas.openxmlformats.org/markup-compatibility/2006" xmlns:r="http://schemas.openxmlformats.org/officeDocument/2006/relationships" xmlns:w="http://schemas.openxmlformats.org/wordprocessingml/2006/main" xmlns:w14="http://schemas.microsoft.com/office/word/2010/wordml" xmlns:w15="http://schemas.microsoft.com/office/word/2012/wordml" xmlns:w16cex="http://schemas.microsoft.com/office/word/2018/wordml/cex" xmlns:w16cid="http://schemas.microsoft.com/office/word/2016/wordml/cid" xmlns:w16="http://schemas.microsoft.com/office/word/2018/wordml" xmlns:w16du="http://schemas.microsoft.com/office/word/2023/wordml/word16du" xmlns:w16sdtdh="http://schemas.microsoft.com/office/word/2020/wordml/sdtdatahash" xmlns:w16sdtfl="http://schemas.microsoft.com/office/word/2024/wordml/sdtformatlock" xmlns:w16se="http://schemas.microsoft.com/office/word/2015/wordml/symex" mc:Ignorable="w14 w15 w16se w16cid w16 w16cex w16sdtdh w16sdtfl w16du">
-  <w:docDefaults>
-    <w:rPrDefault>
-      <w:rPr>
-        <w:rFonts w:asciiTheme="minorHAnsi" w:eastAsiaTheme="minorEastAsia" w:hAnsiTheme="minorHAnsi" w:cstheme="minorBidi"/>
-        <w:kern w:val="2"/>
-        <w:sz w:val="24"/>
-        <w:szCs w:val="24"/>
-        <w:lang w:val="fr-FR" w:eastAsia="fr-FR" w:bidi="ar-SA"/>
-        <w14:ligatures w14:val="standardContextual"/>
-      </w:rPr>
-    </w:rPrDefault>
-    <w:pPrDefault>
-      <w:pPr>
-        <w:spacing w:after="160" w:line="278" w:lineRule="auto"/>
-      </w:pPr>
-    </w:pPrDefault>
-  </w:docDefaults>
-  <w:latentStyles w:defLockedState="0" w:defUIPriority="99" w:defSemiHidden="0" w:defUnhideWhenUsed="0" w:defQFormat="0" w:count="376">
-    <w:lsdException w:name="Normal" w:uiPriority="0" w:qFormat="1"/>
-    <w:lsdException w:name="heading 1" w:uiPriority="9" w:qFormat="1"/>
-    <w:lsdException w:name="heading 2" w:semiHidden="1" w:uiPriority="9" w:unhideWhenUsed="1" w:qFormat="1"/>
-    <w:lsdException w:name="heading 3" w:semiHidden="1" w:uiPriority="9" w:unhideWhenUsed="1" w:qFormat="1"/>
-    <w:lsdException w:name="heading 4" w:semiHidden="1" w:uiPriority="3" w:unhideWhenUsed="1" w:qFormat="1"/>
-    <w:lsdException w:name="heading 5" w:semiHidden="1" w:uiPriority="9" w:unhideWhenUsed="1" w:qFormat="1"/>
-    <w:lsdException w:name="heading 6" w:semiHidden="1" w:uiPriority="9" w:unhideWhenUsed="1" w:qFormat="1"/>
-    <w:lsdException w:name="heading 7" w:semiHidden="1" w:uiPriority="9" w:unhideWhenUsed="1" w:qFormat="1"/>
-    <w:lsdException w:name="heading 8" w:semiHidden="1" w:uiPriority="9" w:unhideWhenUsed="1" w:qFormat="1"/>
-    <w:lsdException w:name="heading 9" w:semiHidden="1" w:uiPriority="9" w:unhideWhenUsed="1" w:qFormat="1"/>
-    <w:lsdException w:name="index 1" w:semiHidden="1" w:unhideWhenUsed="1"/>
-    <w:lsdException w:name="index 2" w:semiHidden="1" w:unhideWhenUsed="1"/>
-    <w:lsdException w:name="index 3" w:semiHidden="1" w:unhideWhenUsed="1"/>
-    <w:lsdException w:name="index 4" w:semiHidden="1" w:unhideWhenUsed="1"/>
-    <w:lsdException w:name="index 5" w:semiHidden="1" w:unhideWhenUsed="1"/>
-    <w:lsdException w:name="index 6" w:semiHidden="1" w:unhideWhenUsed="1"/>
-    <w:lsdException w:name="index 7" w:semiHidden="1" w:unhideWhenUsed="1"/>
-    <w:lsdException w:name="index 8" w:semiHidden="1" w:unhideWhenUsed="1"/>
-    <w:lsdException w:name="index 9" w:semiHidden="1" w:unhideWhenUsed="1"/>
-    <w:lsdException w:name="toc 1" w:semiHidden="1" w:uiPriority="39" w:unhideWhenUsed="1"/>
-    <w:lsdException w:name="toc 2" w:semiHidden="1" w:uiPriority="39" w:unhideWhenUsed="1"/>
-    <w:lsdException w:name="toc 3" w:semiHidden="1" w:uiPriority="39" w:unhideWhenUsed="1"/>
-    <w:lsdException w:name="toc 4" w:semiHidden="1" w:uiPriority="39" w:unhideWhenUsed="1"/>
-    <w:lsdException w:name="toc 5" w:semiHidden="1" w:uiPriority="39" w:unhideWhenUsed="1"/>
-    <w:lsdException w:name="toc 6" w:semiHidden="1" w:uiPriority="39" w:unhideWhenUsed="1"/>
-    <w:lsdException w:name="toc 7" w:semiHidden="1" w:uiPriority="39" w:unhideWhenUsed="1"/>
-    <w:lsdException w:name="toc 8" w:semiHidden="1" w:uiPriority="39" w:unhideWhenUsed="1"/>
-    <w:lsdException w:name="toc 9" w:semiHidden="1" w:uiPriority="39" w:unhideWhenUsed="1"/>
-    <w:lsdException w:name="Normal Indent" w:semiHidden="1" w:unhideWhenUsed="1"/>
-    <w:lsdException w:name="footnote text" w:semiHidden="1" w:unhideWhenUsed="1"/>
-    <w:lsdException w:name="annotation text" w:semiHidden="1" w:unhideWhenUsed="1"/>
-    <w:lsdException w:name="header" w:semiHidden="1" w:unhideWhenUsed="1"/>
-    <w:lsdException w:name="footer" w:semiHidden="1" w:unhideWhenUsed="1"/>
-    <w:lsdException w:name="index heading" w:semiHidden="1" w:unhideWhenUsed="1"/>
-    <w:lsdException w:name="caption" w:semiHidden="1" w:uiPriority="35" w:unhideWhenUsed="1" w:qFormat="1"/>
-    <w:lsdException w:name="table of figures" w:semiHidden="1" w:unhideWhenUsed="1"/>
-    <w:lsdException w:name="envelope address" w:semiHidden="1" w:unhideWhenUsed="1"/>
-    <w:lsdException w:name="envelope return" w:semiHidden="1" w:unhideWhenUsed="1"/>
-    <w:lsdException w:name="footnote reference" w:semiHidden="1" w:unhideWhenUsed="1"/>
-    <w:lsdException w:name="annotation reference" w:semiHidden="1" w:unhideWhenUsed="1"/>
-    <w:lsdException w:name="line number" w:semiHidden="1" w:unhideWhenUsed="1"/>
-    <w:lsdException w:name="page number" w:semiHidden="1" w:unhideWhenUsed="1"/>
-    <w:lsdException w:name="endnote reference" w:semiHidden="1" w:unhideWhenUsed="1"/>
-    <w:lsdException w:name="endnote text" w:semiHidden="1" w:unhideWhenUsed="1"/>
-    <w:lsdException w:name="table of authorities" w:semiHidden="1" w:unhideWhenUsed="1"/>
-    <w:lsdException w:name="macro" w:semiHidden="1" w:unhideWhenUsed="1"/>
-    <w:lsdException w:name="toa heading" w:semiHidden="1" w:unhideWhenUsed="1"/>
-    <w:lsdException w:name="List" w:semiHidden="1" w:unhideWhenUsed="1"/>
-    <w:lsdException w:name="List Bullet" w:semiHidden="1" w:unhideWhenUsed="1"/>
-    <w:lsdException w:name="List Number" w:semiHidden="1" w:unhideWhenUsed="1"/>
-    <w:lsdException w:name="List 2" w:semiHidden="1" w:unhideWhenUsed="1"/>
-    <w:lsdException w:name="List 3" w:semiHidden="1" w:unhideWhenUsed="1"/>
-    <w:lsdException w:name="List 4" w:semiHidden="1" w:unhideWhenUsed="1"/>
-    <w:lsdException w:name="List 5" w:semiHidden="1" w:unhideWhenUsed="1"/>
-    <w:lsdException w:name="List Bullet 2" w:semiHidden="1" w:unhideWhenUsed="1"/>
-    <w:lsdException w:name="List Bullet 3" w:semiHidden="1" w:unhideWhenUsed="1"/>
-    <w:lsdException w:name="List Bullet 4" w:semiHidden="1" w:unhideWhenUsed="1"/>
-    <w:lsdException w:name="List Bullet 5" w:semiHidden="1" w:unhideWhenUsed="1"/>
-    <w:lsdException w:name="List Number 2" w:semiHidden="1" w:unhideWhenUsed="1"/>
-    <w:lsdException w:name="List Number 3" w:semiHidden="1" w:unhideWhenUsed="1"/>
-    <w:lsdException w:name="List Number 4" w:semiHidden="1" w:unhideWhenUsed="1"/>
-    <w:lsdException w:name="List Number 5" w:semiHidden="1" w:unhideWhenUsed="1"/>
-    <w:lsdException w:name="Title" w:uiPriority="10" w:qFormat="1"/>
-    <w:lsdException w:name="Closing" w:semiHidden="1" w:unhideWhenUsed="1"/>
-    <w:lsdException w:name="Signature" w:semiHidden="1" w:unhideWhenUsed="1"/>
-    <w:lsdException w:name="Default Paragraph Font" w:semiHidden="1" w:uiPriority="1" w:unhideWhenUsed="1"/>
-    <w:lsdException w:name="Body Text" w:semiHidden="1" w:unhideWhenUsed="1"/>
-    <w:lsdException w:name="Body Text Indent" w:semiHidden="1" w:unhideWhenUsed="1"/>
-    <w:lsdException w:name="List Continue" w:semiHidden="1" w:unhideWhenUsed="1"/>
-    <w:lsdException w:name="List Continue 2" w:semiHidden="1" w:unhideWhenUsed="1"/>
-    <w:lsdException w:name="List Continue 3" w:semiHidden="1" w:unhideWhenUsed="1"/>
-    <w:lsdException w:name="List Continue 4" w:semiHidden="1" w:unhideWhenUsed="1"/>
-    <w:lsdException w:name="List Continue 5" w:semiHidden="1" w:unhideWhenUsed="1"/>
-    <w:lsdException w:name="Message Header" w:semiHidden="1" w:unhideWhenUsed="1"/>
-    <w:lsdException w:name="Subtitle" w:uiPriority="11" w:qFormat="1"/>
-    <w:lsdException w:name="Salutation" w:semiHidden="1" w:unhideWhenUsed="1"/>
-    <w:lsdException w:name="Date" w:semiHidden="1" w:unhideWhenUsed="1"/>
-    <w:lsdException w:name="Body Text First Indent" w:semiHidden="1" w:unhideWhenUsed="1"/>
-    <w:lsdException w:name="Body Text First Indent 2" w:semiHidden="1" w:unhideWhenUsed="1"/>
-    <w:lsdException w:name="Note Heading" w:semiHidden="1" w:unhideWhenUsed="1"/>
-    <w:lsdException w:name="Body Text 2" w:semiHidden="1" w:unhideWhenUsed="1"/>
-    <w:lsdException w:name="Body Text 3" w:semiHidden="1" w:unhideWhenUsed="1"/>
-    <w:lsdException w:name="Body Text Indent 2" w:semiHidden="1" w:unhideWhenUsed="1"/>
-    <w:lsdException w:name="Body Text Indent 3" w:semiHidden="1" w:unhideWhenUsed="1"/>
-    <w:lsdException w:name="Block Text" w:semiHidden="1" w:unhideWhenUsed="1"/>
-    <w:lsdException w:name="Hyperlink" w:semiHidden="1" w:unhideWhenUsed="1"/>
-    <w:lsdException w:name="FollowedHyperlink" w:semiHidden="1" w:unhideWhenUsed="1"/>
-    <w:lsdException w:name="Strong" w:uiPriority="22" w:qFormat="1"/>
-    <w:lsdException w:name="Emphasis" w:uiPriority="20" w:qFormat="1"/>
-    <w:lsdException w:name="Document Map" w:semiHidden="1" w:unhideWhenUsed="1"/>
-    <w:lsdException w:name="Plain Text" w:semiHidden="1" w:unhideWhenUsed="1"/>
-    <w:lsdException w:name="E-mail Signature" w:semiHidden="1" w:unhideWhenUsed="1"/>
-    <w:lsdException w:name="HTML Top of Form" w:semiHidden="1" w:unhideWhenUsed="1"/>
-    <w:lsdException w:name="HTML Bottom of Form" w:semiHidden="1" w:unhideWhenUsed="1"/>
-    <w:lsdException w:name="Normal (Web)" w:semiHidden="1" w:unhideWhenUsed="1"/>
-    <w:lsdException w:name="HTML Acronym" w:semiHidden="1" w:unhideWhenUsed="1"/>
-    <w:lsdException w:name="HTML Address" w:semiHidden="1" w:unhideWhenUsed="1"/>
-    <w:lsdException w:name="HTML Cite" w:semiHidden="1" w:unhideWhenUsed="1"/>
-    <w:lsdException w:name="HTML Code" w:semiHidden="1" w:unhideWhenUsed="1"/>
-    <w:lsdException w:name="HTML Definition" w:semiHidden="1" w:unhideWhenUsed="1"/>
-    <w:lsdException w:name="HTML Keyboard" w:semiHidden="1" w:unhideWhenUsed="1"/>
-    <w:lsdException w:name="HTML Preformatted" w:semiHidden="1" w:unhideWhenUsed="1"/>
-    <w:lsdException w:name="HTML Sample" w:semiHidden="1" w:unhideWhenUsed="1"/>
-    <w:lsdException w:name="HTML Typewriter" w:semiHidden="1" w:unhideWhenUsed="1"/>
-    <w:lsdException w:name="HTML Variable" w:semiHidden="1" w:unhideWhenUsed="1"/>
-    <w:lsdException w:name="Normal Table" w:semiHidden="1" w:unhideWhenUsed="1"/>
-    <w:lsdException w:name="annotation subject" w:semiHidden="1" w:unhideWhenUsed="1"/>
-    <w:lsdException w:name="No List" w:semiHidden="1" w:unhideWhenUsed="1"/>
-    <w:lsdException w:name="Outline List 1" w:semiHidden="1" w:unhideWhenUsed="1"/>
-    <w:lsdException w:name="Outline List 2" w:semiHidden="1" w:unhideWhenUsed="1"/>
-    <w:lsdException w:name="Outline List 3" w:semiHidden="1" w:unhideWhenUsed="1"/>
-    <w:lsdException w:name="Table Simple 1" w:semiHidden="1" w:unhideWhenUsed="1"/>
-    <w:lsdException w:name="Table Simple 2" w:semiHidden="1" w:unhideWhenUsed="1"/>
-    <w:lsdException w:name="Table Simple 3" w:semiHidden="1" w:unhideWhenUsed="1"/>
-    <w:lsdException w:name="Table Classic 1" w:semiHidden="1" w:unhideWhenUsed="1"/>
-    <w:lsdException w:name="Table Classic 2" w:semiHidden="1" w:unhideWhenUsed="1"/>
-    <w:lsdException w:name="Table Classic 3" w:semiHidden="1" w:unhideWhenUsed="1"/>
-    <w:lsdException w:name="Table Classic 4" w:semiHidden="1" w:unhideWhenUsed="1"/>
-    <w:lsdException w:name="Table Colorful 1" w:semiHidden="1" w:unhideWhenUsed="1"/>
-    <w:lsdException w:name="Table Colorful 2" w:semiHidden="1" w:unhideWhenUsed="1"/>
-    <w:lsdException w:name="Table Colorful 3" w:semiHidden="1" w:unhideWhenUsed="1"/>
-    <w:lsdException w:name="Table Columns 1" w:semiHidden="1" w:unhideWhenUsed="1"/>
-    <w:lsdException w:name="Table Columns 2" w:semiHidden="1" w:unhideWhenUsed="1"/>
-    <w:lsdException w:name="Table Columns 3" w:semiHidden="1" w:unhideWhenUsed="1"/>
-    <w:lsdException w:name="Table Columns 4" w:semiHidden="1" w:unhideWhenUsed="1"/>
-    <w:lsdException w:name="Table Columns 5" w:semiHidden="1" w:unhideWhenUsed="1"/>
-    <w:lsdException w:name="Table Grid 1" w:semiHidden="1" w:unhideWhenUsed="1"/>
-    <w:lsdException w:name="Table Grid 2" w:semiHidden="1" w:unhideWhenUsed="1"/>
-    <w:lsdException w:name="Table Grid 3" w:semiHidden="1" w:unhideWhenUsed="1"/>
-    <w:lsdException w:name="Table Grid 4" w:semiHidden="1" w:unhideWhenUsed="1"/>
-    <w:lsdException w:name="Table Grid 5" w:semiHidden="1" w:unhideWhenUsed="1"/>
-    <w:lsdException w:name="Table Grid 6" w:semiHidden="1" w:unhideWhenUsed="1"/>
-    <w:lsdException w:name="Table Grid 7" w:semiHidden="1" w:unhideWhenUsed="1"/>
-    <w:lsdException w:name="Table Grid 8" w:semiHidden="1" w:unhideWhenUsed="1"/>
-    <w:lsdException w:name="Table List 1" w:semiHidden="1" w:unhideWhenUsed="1"/>
-    <w:lsdException w:name="Table List 2" w:semiHidden="1" w:unhideWhenUsed="1"/>
-    <w:lsdException w:name="Table List 3" w:semiHidden="1" w:unhideWhenUsed="1"/>
-    <w:lsdException w:name="Table List 4" w:semiHidden="1" w:unhideWhenUsed="1"/>
-    <w:lsdException w:name="Table List 5" w:semiHidden="1" w:unhideWhenUsed="1"/>
-    <w:lsdException w:name="Table List 6" w:semiHidden="1" w:unhideWhenUsed="1"/>
-    <w:lsdException w:name="Table List 7" w:semiHidden="1" w:unhideWhenUsed="1"/>
-    <w:lsdException w:name="Table List 8" w:semiHidden="1" w:unhideWhenUsed="1"/>
-    <w:lsdException w:name="Table 3D effects 1" w:semiHidden="1" w:unhideWhenUsed="1"/>
-    <w:lsdException w:name="Table 3D effects 2" w:semiHidden="1" w:unhideWhenUsed="1"/>
-    <w:lsdException w:name="Table 3D effects 3" w:semiHidden="1" w:unhideWhenUsed="1"/>
-    <w:lsdException w:name="Table Contemporary" w:semiHidden="1" w:unhideWhenUsed="1"/>
-    <w:lsdException w:name="Table Elegant" w:semiHidden="1" w:unhideWhenUsed="1"/>
-    <w:lsdException w:name="Table Professional" w:semiHidden="1" w:unhideWhenUsed="1"/>
-    <w:lsdException w:name="Table Subtle 1" w:semiHidden="1" w:unhideWhenUsed="1"/>
-    <w:lsdException w:name="Table Subtle 2" w:semiHidden="1" w:unhideWhenUsed="1"/>
-    <w:lsdException w:name="Table Web 1" w:semiHidden="1" w:unhideWhenUsed="1"/>
-    <w:lsdException w:name="Table Web 2" w:semiHidden="1" w:unhideWhenUsed="1"/>
-    <w:lsdException w:name="Table Web 3" w:semiHidden="1" w:unhideWhenUsed="1"/>
-    <w:lsdException w:name="Balloon Text" w:semiHidden="1" w:unhideWhenUsed="1"/>
-    <w:lsdException w:name="Table Grid" w:uiPriority="39"/>
-    <w:lsdException w:name="Table Theme" w:semiHidden="1" w:unhideWhenUsed="1"/>
-    <w:lsdException w:name="Placeholder Text" w:semiHidden="1"/>
-    <w:lsdException w:name="No Spacing" w:uiPriority="1" w:qFormat="1"/>
-    <w:lsdException w:name="Light Shading" w:uiPriority="60"/>
-    <w:lsdException w:name="Light List" w:uiPriority="61"/>
-    <w:lsdException w:name="Light Grid" w:uiPriority="62"/>
-    <w:lsdException w:name="Medium Shading 1" w:uiPriority="63"/>
-    <w:lsdException w:name="Medium Shading 2" w:uiPriority="64"/>
-    <w:lsdException w:name="Medium List 1" w:uiPriority="65"/>
-    <w:lsdException w:name="Medium List 2" w:uiPriority="66"/>
-    <w:lsdException w:name="Medium Grid 1" w:uiPriority="67"/>
-    <w:lsdException w:name="Medium Grid 2" w:uiPriority="68"/>
-    <w:lsdException w:name="Medium Grid 3" w:uiPriority="69"/>
-    <w:lsdException w:name="Dark List" w:uiPriority="70"/>
-    <w:lsdException w:name="Colorful Shading" w:uiPriority="71"/>
-    <w:lsdException w:name="Colorful List" w:uiPriority="72"/>
-    <w:lsdException w:name="Colorful Grid" w:uiPriority="73"/>
-    <w:lsdException w:name="Light Shading Accent 1" w:uiPriority="60"/>
-    <w:lsdException w:name="Light List Accent 1" w:uiPriority="61"/>
-    <w:lsdException w:name="Light Grid Accent 1" w:uiPriority="62"/>
-    <w:lsdException w:name="Medium Shading 1 Accent 1" w:uiPriority="63"/>
-    <w:lsdException w:name="Medium Shading 2 Accent 1" w:uiPriority="64"/>
-    <w:lsdException w:name="Medium List 1 Accent 1" w:uiPriority="65"/>
-    <w:lsdException w:name="Revision" w:semiHidden="1"/>
-    <w:lsdException w:name="List Paragraph" w:uiPriority="34" w:qFormat="1"/>
-    <w:lsdException w:name="Quote" w:uiPriority="29" w:qFormat="1"/>
-    <w:lsdException w:name="Intense Quote" w:uiPriority="30" w:qFormat="1"/>
-    <w:lsdException w:name="Medium List 2 Accent 1" w:uiPriority="66"/>
-    <w:lsdException w:name="Medium Grid 1 Accent 1" w:uiPriority="67"/>
-    <w:lsdException w:name="Medium Grid 2 Accent 1" w:uiPriority="68"/>
-    <w:lsdException w:name="Medium Grid 3 Accent 1" w:uiPriority="69"/>
-    <w:lsdException w:name="Dark List Accent 1" w:uiPriority="70"/>
-    <w:lsdException w:name="Colorful Shading Accent 1" w:uiPriority="71"/>
-    <w:lsdException w:name="Colorful List Accent 1" w:uiPriority="72"/>
-    <w:lsdException w:name="Colorful Grid Accent 1" w:uiPriority="73"/>
-    <w:lsdException w:name="Light Shading Accent 2" w:uiPriority="60"/>
-    <w:lsdException w:name="Light List Accent 2" w:uiPriority="61"/>
-    <w:lsdException w:name="Light Grid Accent 2" w:uiPriority="62"/>
-    <w:lsdException w:name="Medium Shading 1 Accent 2" w:uiPriority="63"/>
-    <w:lsdException w:name="Medium Shading 2 Accent 2" w:uiPriority="64"/>
-    <w:lsdException w:name="Medium List 1 Accent 2" w:uiPriority="65"/>
-    <w:lsdException w:name="Medium List 2 Accent 2" w:uiPriority="66"/>
-    <w:lsdException w:name="Medium Grid 1 Accent 2" w:uiPriority="67"/>
-    <w:lsdException w:name="Medium Grid 2 Accent 2" w:uiPriority="68"/>
-    <w:lsdException w:name="Medium Grid 3 Accent 2" w:uiPriority="69"/>
-    <w:lsdException w:name="Dark List Accent 2" w:uiPriority="70"/>
-    <w:lsdException w:name="Colorful Shading Accent 2" w:uiPriority="71"/>
-    <w:lsdException w:name="Colorful List Accent 2" w:uiPriority="72"/>
-    <w:lsdException w:name="Colorful Grid Accent 2" w:uiPriority="73"/>
-    <w:lsdException w:name="Light Shading Accent 3" w:uiPriority="60"/>
-    <w:lsdException w:name="Light List Accent 3" w:uiPriority="61"/>
-    <w:lsdException w:name="Light Grid Accent 3" w:uiPriority="62"/>
-    <w:lsdException w:name="Medium Shading 1 Accent 3" w:uiPriority="63"/>
-    <w:lsdException w:name="Medium Shading 2 Accent 3" w:uiPriority="64"/>
-    <w:lsdException w:name="Medium List 1 Accent 3" w:uiPriority="65"/>
-    <w:lsdException w:name="Medium List 2 Accent 3" w:uiPriority="66"/>
-    <w:lsdException w:name="Medium Grid 1 Accent 3" w:uiPriority="67"/>
-    <w:lsdException w:name="Medium Grid 2 Accent 3" w:uiPriority="68"/>
-    <w:lsdException w:name="Medium Grid 3 Accent 3" w:uiPriority="69"/>
-    <w:lsdException w:name="Dark List Accent 3" w:uiPriority="70"/>
-    <w:lsdException w:name="Colorful Shading Accent 3" w:uiPriority="71"/>
-    <w:lsdException w:name="Colorful List Accent 3" w:uiPriority="72"/>
-    <w:lsdException w:name="Colorful Grid Accent 3" w:uiPriority="73"/>
-    <w:lsdException w:name="Light Shading Accent 4" w:uiPriority="60"/>
-    <w:lsdException w:name="Light List Accent 4" w:uiPriority="61"/>
-    <w:lsdException w:name="Light Grid Accent 4" w:uiPriority="62"/>
-    <w:lsdException w:name="Medium Shading 1 Accent 4" w:uiPriority="63"/>
-    <w:lsdException w:name="Medium Shading 2 Accent 4" w:uiPriority="64"/>
-    <w:lsdException w:name="Medium List 1 Accent 4" w:uiPriority="65"/>
-    <w:lsdException w:name="Medium List 2 Accent 4" w:uiPriority="66"/>
-    <w:lsdException w:name="Medium Grid 1 Accent 4" w:uiPriority="67"/>
-    <w:lsdException w:name="Medium Grid 2 Accent 4" w:uiPriority="68"/>
-    <w:lsdException w:name="Medium Grid 3 Accent 4" w:uiPriority="69"/>
-    <w:lsdException w:name="Dark List Accent 4" w:uiPriority="70"/>
-    <w:lsdException w:name="Colorful Shading Accent 4" w:uiPriority="71"/>
-    <w:lsdException w:name="Colorful List Accent 4" w:uiPriority="72"/>
-    <w:lsdException w:name="Colorful Grid Accent 4" w:uiPriority="73"/>
-    <w:lsdException w:name="Light Shading Accent 5" w:uiPriority="60"/>
-    <w:lsdException w:name="Light List Accent 5" w:uiPriority="61"/>
-    <w:lsdException w:name="Light Grid Accent 5" w:uiPriority="62"/>
-    <w:lsdException w:name="Medium Shading 1 Accent 5" w:uiPriority="63"/>
-    <w:lsdException w:name="Medium Shading 2 Accent 5" w:uiPriority="64"/>
-    <w:lsdException w:name="Medium List 1 Accent 5" w:uiPriority="65"/>
-    <w:lsdException w:name="Medium List 2 Accent 5" w:uiPriority="66"/>
-    <w:lsdException w:name="Medium Grid 1 Accent 5" w:uiPriority="67"/>
-    <w:lsdException w:name="Medium Grid 2 Accent 5" w:uiPriority="68"/>
-    <w:lsdException w:name="Medium Grid 3 Accent 5" w:uiPriority="69"/>
-    <w:lsdException w:name="Dark List Accent 5" w:uiPriority="70"/>
-    <w:lsdException w:name="Colorful Shading Accent 5" w:uiPriority="71"/>
-    <w:lsdException w:name="Colorful List Accent 5" w:uiPriority="72"/>
-    <w:lsdException w:name="Colorful Grid Accent 5" w:uiPriority="73"/>
-    <w:lsdException w:name="Light Shading Accent 6" w:uiPriority="60"/>
-    <w:lsdException w:name="Light List Accent 6" w:uiPriority="61"/>
-    <w:lsdException w:name="Light Grid Accent 6" w:uiPriority="62"/>
-    <w:lsdException w:name="Medium Shading 1 Accent 6" w:uiPriority="63"/>
-    <w:lsdException w:name="Medium Shading 2 Accent 6" w:uiPriority="64"/>
-    <w:lsdException w:name="Medium List 1 Accent 6" w:uiPriority="65"/>
-    <w:lsdException w:name="Medium List 2 Accent 6" w:uiPriority="66"/>
-    <w:lsdException w:name="Medium Grid 1 Accent 6" w:uiPriority="67"/>
-    <w:lsdException w:name="Medium Grid 2 Accent 6" w:uiPriority="68"/>
-    <w:lsdException w:name="Medium Grid 3 Accent 6" w:uiPriority="69"/>
-    <w:lsdException w:name="Dark List Accent 6" w:uiPriority="70"/>
-    <w:lsdException w:name="Colorful Shading Accent 6" w:uiPriority="71"/>
-    <w:lsdException w:name="Colorful List Accent 6" w:uiPriority="72"/>
-    <w:lsdException w:name="Colorful Grid Accent 6" w:uiPriority="73"/>
-    <w:lsdException w:name="Subtle Emphasis" w:uiPriority="19" w:qFormat="1"/>
-    <w:lsdException w:name="Intense Emphasis" w:uiPriority="21" w:qFormat="1"/>
-    <w:lsdException w:name="Subtle Reference" w:uiPriority="31" w:qFormat="1"/>
-    <w:lsdException w:name="Intense Reference" w:uiPriority="32" w:qFormat="1"/>
-    <w:lsdException w:name="Book Title" w:uiPriority="33" w:qFormat="1"/>
-    <w:lsdException w:name="Bibliography" w:semiHidden="1" w:uiPriority="37" w:unhideWhenUsed="1"/>
-    <w:lsdException w:name="TOC Heading" w:semiHidden="1" w:uiPriority="39" w:unhideWhenUsed="1" w:qFormat="1"/>
-    <w:lsdException w:name="Plain Table 1" w:uiPriority="41"/>
-    <w:lsdException w:name="Plain Table 2" w:uiPriority="42"/>
-    <w:lsdException w:name="Plain Table 3" w:uiPriority="43"/>
-    <w:lsdException w:name="Plain Table 4" w:uiPriority="44"/>
-    <w:lsdException w:name="Plain Table 5" w:uiPriority="45"/>
-    <w:lsdException w:name="Grid Table Light" w:uiPriority="40"/>
-    <w:lsdException w:name="Grid Table 1 Light" w:uiPriority="46"/>
-    <w:lsdException w:name="Grid Table 2" w:uiPriority="47"/>
-    <w:lsdException w:name="Grid Table 3" w:uiPriority="48"/>
-    <w:lsdException w:name="Grid Table 4" w:uiPriority="49"/>
-    <w:lsdException w:name="Grid Table 5 Dark" w:uiPriority="50"/>
-    <w:lsdException w:name="Grid Table 6 Colorful" w:uiPriority="51"/>
-    <w:lsdException w:name="Grid Table 7 Colorful" w:uiPriority="52"/>
-    <w:lsdException w:name="Grid Table 1 Light Accent 1" w:uiPriority="46"/>
-    <w:lsdException w:name="Grid Table 2 Accent 1" w:uiPriority="47"/>
-    <w:lsdException w:name="Grid Table 3 Accent 1" w:uiPriority="48"/>
-    <w:lsdException w:name="Grid Table 4 Accent 1" w:uiPriority="49"/>
-    <w:lsdException w:name="Grid Table 5 Dark Accent 1" w:uiPriority="50"/>
-    <w:lsdException w:name="Grid Table 6 Colorful Accent 1" w:uiPriority="51"/>
-    <w:lsdException w:name="Grid Table 7 Colorful Accent 1" w:uiPriority="52"/>
-    <w:lsdException w:name="Grid Table 1 Light Accent 2" w:uiPriority="46"/>
-    <w:lsdException w:name="Grid Table 2 Accent 2" w:uiPriority="47"/>
-    <w:lsdException w:name="Grid Table 3 Accent 2" w:uiPriority="48"/>
-    <w:lsdException w:name="Grid Table 4 Accent 2" w:uiPriority="49"/>
-    <w:lsdException w:name="Grid Table 5 Dark Accent 2" w:uiPriority="50"/>
-    <w:lsdException w:name="Grid Table 6 Colorful Accent 2" w:uiPriority="51"/>
-    <w:lsdException w:name="Grid Table 7 Colorful Accent 2" w:uiPriority="52"/>
-    <w:lsdException w:name="Grid Table 1 Light Accent 3" w:uiPriority="46"/>
-    <w:lsdException w:name="Grid Table 2 Accent 3" w:uiPriority="47"/>
-    <w:lsdException w:name="Grid Table 3 Accent 3" w:uiPriority="48"/>
-    <w:lsdException w:name="Grid Table 4 Accent 3" w:uiPriority="49"/>
-    <w:lsdException w:name="Grid Table 5 Dark Accent 3" w:uiPriority="50"/>
-    <w:lsdException w:name="Grid Table 6 Colorful Accent 3" w:uiPriority="51"/>
-    <w:lsdException w:name="Grid Table 7 Colorful Accent 3" w:uiPriority="52"/>
-    <w:lsdException w:name="Grid Table 1 Light Accent 4" w:uiPriority="46"/>
-    <w:lsdException w:name="Grid Table 2 Accent 4" w:uiPriority="47"/>
-    <w:lsdException w:name="Grid Table 3 Accent 4" w:uiPriority="48"/>
-    <w:lsdException w:name="Grid Table 4 Accent 4" w:uiPriority="49"/>
-    <w:lsdException w:name="Grid Table 5 Dark Accent 4" w:uiPriority="50"/>
-    <w:lsdException w:name="Grid Table 6 Colorful Accent 4" w:uiPriority="51"/>
-    <w:lsdException w:name="Grid Table 7 Colorful Accent 4" w:uiPriority="52"/>
-    <w:lsdException w:name="Grid Table 1 Light Accent 5" w:uiPriority="46"/>
-    <w:lsdException w:name="Grid Table 2 Accent 5" w:uiPriority="47"/>
-    <w:lsdException w:name="Grid Table 3 Accent 5" w:uiPriority="48"/>
-    <w:lsdException w:name="Grid Table 4 Accent 5" w:uiPriority="49"/>
-    <w:lsdException w:name="Grid Table 5 Dark Accent 5" w:uiPriority="50"/>
-    <w:lsdException w:name="Grid Table 6 Colorful Accent 5" w:uiPriority="51"/>
-    <w:lsdException w:name="Grid Table 7 Colorful Accent 5" w:uiPriority="52"/>
-    <w:lsdException w:name="Grid Table 1 Light Accent 6" w:uiPriority="46"/>
-    <w:lsdException w:name="Grid Table 2 Accent 6" w:uiPriority="47"/>
-    <w:lsdException w:name="Grid Table 3 Accent 6" w:uiPriority="48"/>
-    <w:lsdException w:name="Grid Table 4 Accent 6" w:uiPriority="49"/>
-    <w:lsdException w:name="Grid Table 5 Dark Accent 6" w:uiPriority="50"/>
-    <w:lsdException w:name="Grid Table 6 Colorful Accent 6" w:uiPriority="51"/>
-    <w:lsdException w:name="Grid Table 7 Colorful Accent 6" w:uiPriority="52"/>
-    <w:lsdException w:name="List Table 1 Light" w:uiPriority="46"/>
-    <w:lsdException w:name="List Table 2" w:uiPriority="47"/>
-    <w:lsdException w:name="List Table 3" w:uiPriority="48"/>
-    <w:lsdException w:name="List Table 4" w:uiPriority="49"/>
-    <w:lsdException w:name="List Table 5 Dark" w:uiPriority="50"/>
-    <w:lsdException w:name="List Table 6 Colorful" w:uiPriority="51"/>
-    <w:lsdException w:name="List Table 7 Colorful" w:uiPriority="52"/>
-    <w:lsdException w:name="List Table 1 Light Accent 1" w:uiPriority="46"/>
-    <w:lsdException w:name="List Table 2 Accent 1" w:uiPriority="47"/>
-    <w:lsdException w:name="List Table 3 Accent 1" w:uiPriority="48"/>
-    <w:lsdException w:name="List Table 4 Accent 1" w:uiPriority="49"/>
-    <w:lsdException w:name="List Table 5 Dark Accent 1" w:uiPriority="50"/>
-    <w:lsdException w:name="List Table 6 Colorful Accent 1" w:uiPriority="51"/>
-    <w:lsdException w:name="List Table 7 Colorful Accent 1" w:uiPriority="52"/>
-    <w:lsdException w:name="List Table 1 Light Accent 2" w:uiPriority="46"/>
-    <w:lsdException w:name="List Table 2 Accent 2" w:uiPriority="47"/>
-    <w:lsdException w:name="List Table 3 Accent 2" w:uiPriority="48"/>
-    <w:lsdException w:name="List Table 4 Accent 2" w:uiPriority="49"/>
-    <w:lsdException w:name="List Table 5 Dark Accent 2" w:uiPriority="50"/>
-    <w:lsdException w:name="List Table 6 Colorful Accent 2" w:uiPriority="51"/>
-    <w:lsdException w:name="List Table 7 Colorful Accent 2" w:uiPriority="52"/>
-    <w:lsdException w:name="List Table 1 Light Accent 3" w:uiPriority="46"/>
-    <w:lsdException w:name="List Table 2 Accent 3" w:uiPriority="47"/>
-    <w:lsdException w:name="List Table 3 Accent 3" w:uiPriority="48"/>
-    <w:lsdException w:name="List Table 4 Accent 3" w:uiPriority="49"/>
-    <w:lsdException w:name="List Table 5 Dark Accent 3" w:uiPriority="50"/>
-    <w:lsdException w:name="List Table 6 Colorful Accent 3" w:uiPriority="51"/>
-    <w:lsdException w:name="List Table 7 Colorful Accent 3" w:uiPriority="52"/>
-    <w:lsdException w:name="List Table 1 Light Accent 4" w:uiPriority="46"/>
-    <w:lsdException w:name="List Table 2 Accent 4" w:uiPriority="47"/>
-    <w:lsdException w:name="List Table 3 Accent 4" w:uiPriority="48"/>
-    <w:lsdException w:name="List Table 4 Accent 4" w:uiPriority="49"/>
-    <w:lsdException w:name="List Table 5 Dark Accent 4" w:uiPriority="50"/>
-    <w:lsdException w:name="List Table 6 Colorful Accent 4" w:uiPriority="51"/>
-    <w:lsdException w:name="List Table 7 Colorful Accent 4" w:uiPriority="52"/>
-    <w:lsdException w:name="List Table 1 Light Accent 5" w:uiPriority="46"/>
-    <w:lsdException w:name="List Table 2 Accent 5" w:uiPriority="47"/>
-    <w:lsdException w:name="List Table 3 Accent 5" w:uiPriority="48"/>
-    <w:lsdException w:name="List Table 4 Accent 5" w:uiPriority="49"/>
-    <w:lsdException w:name="List Table 5 Dark Accent 5" w:uiPriority="50"/>
-    <w:lsdException w:name="List Table 6 Colorful Accent 5" w:uiPriority="51"/>
-    <w:lsdException w:name="List Table 7 Colorful Accent 5" w:uiPriority="52"/>
-    <w:lsdException w:name="List Table 1 Light Accent 6" w:uiPriority="46"/>
-    <w:lsdException w:name="List Table 2 Accent 6" w:uiPriority="47"/>
-    <w:lsdException w:name="List Table 3 Accent 6" w:uiPriority="48"/>
-    <w:lsdException w:name="List Table 4 Accent 6" w:uiPriority="49"/>
-    <w:lsdException w:name="List Table 5 Dark Accent 6" w:uiPriority="50"/>
-    <w:lsdException w:name="List Table 6 Colorful Accent 6" w:uiPriority="51"/>
-    <w:lsdException w:name="List Table 7 Colorful Accent 6" w:uiPriority="52"/>
-    <w:lsdException w:name="Mention" w:semiHidden="1" w:unhideWhenUsed="1"/>
-    <w:lsdException w:name="Smart Hyperlink" w:semiHidden="1" w:unhideWhenUsed="1"/>
-    <w:lsdException w:name="Hashtag" w:semiHidden="1" w:unhideWhenUsed="1"/>
-    <w:lsdException w:name="Unresolved Mention" w:semiHidden="1" w:unhideWhenUsed="1"/>
-    <w:lsdException w:name="Smart Link" w:semiHidden="1" w:unhideWhenUsed="1"/>
-  </w:latentStyles>
-  <w:style w:type="paragraph" w:default="1" w:styleId="Normal">
-    <w:name w:val="Normal"/>
-    <w:qFormat/>
-  </w:style>
-  <w:style w:type="paragraph" w:styleId="Titre4">
-    <w:name w:val="heading 4"/>
-    <w:basedOn w:val="Normal"/>
-    <w:next w:val="Normal"/>
-    <w:link w:val="Titre4Car"/>
-    <w:uiPriority w:val="3"/>
-    <w:qFormat/>
-    <w:pPr>
-      <w:keepNext/>
-      <w:keepLines/>
-      <w:spacing w:after="0" w:line="240" w:lineRule="auto"/>
-      <w:outlineLvl w:val="3"/>
-    </w:pPr>
+  <w:style w:type="character" w:styleId="Lienhypertexte">
+    <w:name w:val="Hyperlink"/>
+    <w:basedOn w:val="Policepardfaut"/>
+    <w:uiPriority w:val="99"/>
+    <w:semiHidden/>
+    <w:rsid w:val="00517F63"/>
     <w:rPr>
-      <w:rFonts w:eastAsiaTheme="majorEastAsia" w:cstheme="majorBidi"/>
-      <w:i/>
-      <w:iCs/>
-      <w:color w:val="000000" w:themeColor="text1"/>
-      <w:kern w:val="0"/>
-      <w:sz w:val="30"/>
-      <w:lang w:eastAsia="en-US"/>
-      <w14:ligatures w14:val="none"/>
+      <w:color w:val="0000FF" w:themeColor="hyperlink"/>
+      <w:u w:val="single"/>
     </w:rPr>
   </w:style>
-  <w:style w:type="character" w:default="1" w:styleId="Policepardfaut">
-    <w:name w:val="Default Paragraph Font"/>
-    <w:uiPriority w:val="1"/>
-    <w:semiHidden/>
-    <w:unhideWhenUsed/>
-  </w:style>
-  <w:style w:type="table" w:default="1" w:styleId="TableauNormal">
-    <w:name w:val="Normal Table"/>
+  <w:style w:type="character" w:styleId="Mentionnonrsolue">
+    <w:name w:val="Unresolved Mention"/>
+    <w:basedOn w:val="Policepardfaut"/>
     <w:uiPriority w:val="99"/>
     <w:semiHidden/>
     <w:unhideWhenUsed/>
-    <w:tblPr>
-      <w:tblInd w:w="0" w:type="dxa"/>
-      <w:tblCellMar>
-        <w:top w:w="0" w:type="dxa"/>
-        <w:left w:w="108" w:type="dxa"/>
-        <w:bottom w:w="0" w:type="dxa"/>
-        <w:right w:w="108" w:type="dxa"/>
-      </w:tblCellMar>
-    </w:tblPr>
+    <w:rsid w:val="00517F63"/>
+    <w:rPr>
+      <w:color w:val="605E5C"/>
+      <w:shd w:val="clear" w:color="auto" w:fill="E1DFDD"/>
+    </w:rPr>
   </w:style>
-  <w:style w:type="numbering" w:default="1" w:styleId="Aucuneliste">
-    <w:name w:val="No List"/>
+  <w:style w:type="character" w:styleId="Lienhypertextesuivivisit">
+    <w:name w:val="FollowedHyperlink"/>
+    <w:basedOn w:val="Policepardfaut"/>
     <w:uiPriority w:val="99"/>
     <w:semiHidden/>
-    <w:unhideWhenUsed/>
-  </w:style>
-  <w:style w:type="character" w:customStyle="1" w:styleId="Titre4Car">
-    <w:name w:val="Titre 4 Car"/>
-    <w:basedOn w:val="Policepardfaut"/>
-    <w:link w:val="Titre4"/>
-    <w:uiPriority w:val="3"/>
+    <w:rsid w:val="00517F63"/>
     <w:rPr>
-      <w:rFonts w:eastAsiaTheme="majorEastAsia" w:cstheme="majorBidi"/>
-      <w:i/>
-      <w:iCs/>
-      <w:color w:val="000000" w:themeColor="text1"/>
-      <w:kern w:val="0"/>
-      <w:sz w:val="30"/>
-      <w:lang w:eastAsia="en-US"/>
-      <w14:ligatures w14:val="none"/>
+      <w:color w:val="FF00FF" w:themeColor="followedHyperlink"/>
+      <w:u w:val="single"/>
     </w:rPr>
   </w:style>
-  <w:style w:type="character" w:styleId="Accentuation">
-    <w:name w:val="Emphasis"/>
-    <w:basedOn w:val="Policepardfaut"/>
-    <w:uiPriority w:val="20"/>
-    <w:qFormat/>
-    <w:rPr>
-      <w:i w:val="0"/>
-      <w:iCs/>
-      <w:color w:val="ED7D31" w:themeColor="accent2"/>
-    </w:rPr>
-  </w:style>
-  <w:style w:type="paragraph" w:styleId="Citation">
-    <w:name w:val="Quote"/>
-    <w:basedOn w:val="Normal"/>
-    <w:next w:val="Normal"/>
-    <w:link w:val="CitationCar"/>
-    <w:uiPriority w:val="29"/>
-    <w:qFormat/>
-    <w:pPr>
-      <w:spacing w:after="0" w:line="192" w:lineRule="auto"/>
-      <w:jc w:val="center"/>
-    </w:pPr>
-    <w:rPr>
-      <w:rFonts w:asciiTheme="majorHAnsi" w:eastAsiaTheme="minorHAnsi" w:hAnsiTheme="majorHAnsi"/>
-      <w:iCs/>
-      <w:color w:val="4472C4" w:themeColor="accent1"/>
-      <w:kern w:val="0"/>
-      <w:sz w:val="70"/>
-      <w:lang w:eastAsia="en-US"/>
-      <w14:ligatures w14:val="none"/>
-    </w:rPr>
-  </w:style>
-  <w:style w:type="character" w:customStyle="1" w:styleId="CitationCar">
-    <w:name w:val="Citation Car"/>
-    <w:basedOn w:val="Policepardfaut"/>
-    <w:link w:val="Citation"/>
-    <w:uiPriority w:val="29"/>
-    <w:rPr>
-      <w:rFonts w:asciiTheme="majorHAnsi" w:eastAsiaTheme="minorHAnsi" w:hAnsiTheme="majorHAnsi"/>
-      <w:iCs/>
-      <w:color w:val="4472C4" w:themeColor="accent1"/>
-      <w:kern w:val="0"/>
-      <w:sz w:val="70"/>
-      <w:lang w:eastAsia="en-US"/>
-      <w14:ligatures w14:val="none"/>
-    </w:rPr>
-  </w:style>
-  <w:style w:type="paragraph" w:customStyle="1" w:styleId="64D5FE19A79E4FBBB93BDEFFD49DC7A0">
-    <w:name w:val="64D5FE19A79E4FBBB93BDEFFD49DC7A0"/>
-    <w:rsid w:val="00707C7F"/>
-  </w:style>
 </w:styles>
-</file>
-
-<file path=word/glossary/webSettings.xml><?xml version="1.0" encoding="utf-8"?>
-<w:webSettings xmlns:mc="http://schemas.openxmlformats.org/markup-compatibility/2006" xmlns:r="http://schemas.openxmlformats.org/officeDocument/2006/relationships" xmlns:w="http://schemas.openxmlformats.org/wordprocessingml/2006/main" xmlns:w14="http://schemas.microsoft.com/office/word/2010/wordml" xmlns:w15="http://schemas.microsoft.com/office/word/2012/wordml" xmlns:w16cex="http://schemas.microsoft.com/office/word/2018/wordml/cex" xmlns:w16cid="http://schemas.microsoft.com/office/word/2016/wordml/cid" xmlns:w16="http://schemas.microsoft.com/office/word/2018/wordml" xmlns:w16du="http://schemas.microsoft.com/office/word/2023/wordml/word16du" xmlns:w16sdtdh="http://schemas.microsoft.com/office/word/2020/wordml/sdtdatahash" xmlns:w16sdtfl="http://schemas.microsoft.com/office/word/2024/wordml/sdtformatlock" xmlns:w16se="http://schemas.microsoft.com/office/word/2015/wordml/symex" mc:Ignorable="w14 w15 w16se w16cid w16 w16cex w16sdtdh w16sdtfl w16du">
-  <w:optimizeForBrowser/>
-  <w:allowPNG/>
-</w:webSettings>
 </file>
 
 <file path=word/theme/theme1.xml><?xml version="1.0" encoding="utf-8"?>
@@ -4786,6 +4466,24 @@
 </file>
 
 <file path=customXml/item1.xml><?xml version="1.0" encoding="utf-8"?>
+<?mso-contentType ?>
+<FormTemplates xmlns="http://schemas.microsoft.com/sharepoint/v3/contenttype/forms">
+  <Display>DocumentLibraryForm</Display>
+  <Edit>DocumentLibraryForm</Edit>
+  <New>DocumentLibraryForm</New>
+</FormTemplates>
+</file>
+
+<file path=customXml/item2.xml><?xml version="1.0" encoding="utf-8"?>
+<p:properties xmlns:p="http://schemas.microsoft.com/office/2006/metadata/properties" xmlns:xsi="http://www.w3.org/2001/XMLSchema-instance" xmlns:pc="http://schemas.microsoft.com/office/infopath/2007/PartnerControls">
+  <documentManagement>
+    <Status xmlns="71af3243-3dd4-4a8d-8c0d-dd76da1f02a5">Not started</Status>
+    <MediaServiceKeyPoints xmlns="71af3243-3dd4-4a8d-8c0d-dd76da1f02a5" xsi:nil="true"/>
+  </documentManagement>
+</p:properties>
+</file>
+
+<file path=customXml/item3.xml><?xml version="1.0" encoding="utf-8"?>
 <ct:contentTypeSchema xmlns:ct="http://schemas.microsoft.com/office/2006/metadata/contentType" xmlns:ma="http://schemas.microsoft.com/office/2006/metadata/properties/metaAttributes" ct:_="" ma:_="" ma:contentTypeName="Document" ma:contentTypeID="0x01010079F111ED35F8CC479449609E8A0923A6" ma:contentTypeVersion="12" ma:contentTypeDescription="Create a new document." ma:contentTypeScope="" ma:versionID="fa6e671f1cd7e4d96ff9652be322dd5e">
   <xsd:schema xmlns:xsd="http://www.w3.org/2001/XMLSchema" xmlns:xs="http://www.w3.org/2001/XMLSchema" xmlns:p="http://schemas.microsoft.com/office/2006/metadata/properties" xmlns:ns2="71af3243-3dd4-4a8d-8c0d-dd76da1f02a5" xmlns:ns3="16c05727-aa75-4e4a-9b5f-8a80a1165891" targetNamespace="http://schemas.microsoft.com/office/2006/metadata/properties" ma:root="true" ma:fieldsID="4e2496f70b101db0b8013f30a071bbf7" ns2:_="" ns3:_="">
     <xsd:import namespace="71af3243-3dd4-4a8d-8c0d-dd76da1f02a5"/>
@@ -5006,25 +4704,25 @@
 </ct:contentTypeSchema>
 </file>
 
-<file path=customXml/item2.xml><?xml version="1.0" encoding="utf-8"?>
-<p:properties xmlns:p="http://schemas.microsoft.com/office/2006/metadata/properties" xmlns:xsi="http://www.w3.org/2001/XMLSchema-instance" xmlns:pc="http://schemas.microsoft.com/office/infopath/2007/PartnerControls">
-  <documentManagement>
-    <Status xmlns="71af3243-3dd4-4a8d-8c0d-dd76da1f02a5">Not started</Status>
-    <MediaServiceKeyPoints xmlns="71af3243-3dd4-4a8d-8c0d-dd76da1f02a5" xsi:nil="true"/>
-  </documentManagement>
-</p:properties>
+<file path=customXml/itemProps1.xml><?xml version="1.0" encoding="utf-8"?>
+<ds:datastoreItem xmlns:ds="http://schemas.openxmlformats.org/officeDocument/2006/customXml" ds:itemID="{EF425F07-5221-4468-81DD-0F0C28E7FD98}">
+  <ds:schemaRefs>
+    <ds:schemaRef ds:uri="http://schemas.microsoft.com/sharepoint/v3/contenttype/forms"/>
+  </ds:schemaRefs>
+</ds:datastoreItem>
 </file>
 
-<file path=customXml/item3.xml><?xml version="1.0" encoding="utf-8"?>
-<?mso-contentType ?>
-<FormTemplates xmlns="http://schemas.microsoft.com/sharepoint/v3/contenttype/forms">
-  <Display>DocumentLibraryForm</Display>
-  <Edit>DocumentLibraryForm</Edit>
-  <New>DocumentLibraryForm</New>
-</FormTemplates>
+<file path=customXml/itemProps2.xml><?xml version="1.0" encoding="utf-8"?>
+<ds:datastoreItem xmlns:ds="http://schemas.openxmlformats.org/officeDocument/2006/customXml" ds:itemID="{57798B56-5215-4AD8-847F-8A1F1C10FD6F}">
+  <ds:schemaRefs>
+    <ds:schemaRef ds:uri="http://schemas.microsoft.com/office/2006/metadata/properties"/>
+    <ds:schemaRef ds:uri="http://schemas.microsoft.com/office/infopath/2007/PartnerControls"/>
+    <ds:schemaRef ds:uri="71af3243-3dd4-4a8d-8c0d-dd76da1f02a5"/>
+  </ds:schemaRefs>
+</ds:datastoreItem>
 </file>
 
-<file path=customXml/itemProps1.xml><?xml version="1.0" encoding="utf-8"?>
+<file path=customXml/itemProps3.xml><?xml version="1.0" encoding="utf-8"?>
 <ds:datastoreItem xmlns:ds="http://schemas.openxmlformats.org/officeDocument/2006/customXml" ds:itemID="{507D20CB-E94B-44E8-97C3-44BC9C1AF38A}">
   <ds:schemaRefs>
     <ds:schemaRef ds:uri="http://schemas.microsoft.com/office/2006/metadata/contentType"/>
@@ -5041,22 +4739,4 @@
     <ds:schemaRef ds:uri="http://schemas.microsoft.com/internal/obd"/>
   </ds:schemaRefs>
 </ds:datastoreItem>
-</file>
-
-<file path=customXml/itemProps2.xml><?xml version="1.0" encoding="utf-8"?>
-<ds:datastoreItem xmlns:ds="http://schemas.openxmlformats.org/officeDocument/2006/customXml" ds:itemID="{57798B56-5215-4AD8-847F-8A1F1C10FD6F}">
-  <ds:schemaRefs>
-    <ds:schemaRef ds:uri="http://schemas.microsoft.com/office/2006/metadata/properties"/>
-    <ds:schemaRef ds:uri="http://schemas.microsoft.com/office/infopath/2007/PartnerControls"/>
-    <ds:schemaRef ds:uri="71af3243-3dd4-4a8d-8c0d-dd76da1f02a5"/>
-  </ds:schemaRefs>
-</ds:datastoreItem>
-</file>
-
-<file path=customXml/itemProps3.xml><?xml version="1.0" encoding="utf-8"?>
-<ds:datastoreItem xmlns:ds="http://schemas.openxmlformats.org/officeDocument/2006/customXml" ds:itemID="{EF425F07-5221-4468-81DD-0F0C28E7FD98}">
-  <ds:schemaRefs>
-    <ds:schemaRef ds:uri="http://schemas.microsoft.com/sharepoint/v3/contenttype/forms"/>
-  </ds:schemaRefs>
-</ds:datastoreItem>
 </file>
</xml_diff>